<commit_message>
Lock in channel name: Shielded Tonight Prayers
Update thumbnail ribbons, banner prompt, master prompt inputs, the
video 01 description and both Word packs.

Co-Authored-By: Claude Opus 5.5 <noreply@anthropic.com>
Claude-Session: https://claude.ai/code/session_01SdeBQvGzdUbVDGE5p33RTV
</commit_message>
<xml_diff>
--- a/Channel-Clone-Production-Pack.docx
+++ b/Channel-Clone-Production-Pack.docx
@@ -7,25 +7,7 @@
         <w:pStyle w:val="Title"/>
       </w:pPr>
       <w:r>
-        <w:t xml:space="preserve">Channel</w:t>
-      </w:r>
-      <w:r>
-        <w:t xml:space="preserve"> </w:t>
-      </w:r>
-      <w:r>
-        <w:t xml:space="preserve">Clone</w:t>
-      </w:r>
-      <w:r>
-        <w:t xml:space="preserve"> </w:t>
-      </w:r>
-      <w:r>
-        <w:t xml:space="preserve">Production</w:t>
-      </w:r>
-      <w:r>
-        <w:t xml:space="preserve"> </w:t>
-      </w:r>
-      <w:r>
-        <w:t xml:space="preserve">Pack</w:t>
+        <w:t xml:space="preserve">Channel Clone Production Pack</w:t>
       </w:r>
     </w:p>
     <w:p>
@@ -33,79 +15,7 @@
         <w:pStyle w:val="Subtitle"/>
       </w:pPr>
       <w:r>
-        <w:t xml:space="preserve">Night</w:t>
-      </w:r>
-      <w:r>
-        <w:t xml:space="preserve"> </w:t>
-      </w:r>
-      <w:r>
-        <w:t xml:space="preserve">Deliverance</w:t>
-      </w:r>
-      <w:r>
-        <w:t xml:space="preserve"> </w:t>
-      </w:r>
-      <w:r>
-        <w:t xml:space="preserve">Prayer</w:t>
-      </w:r>
-      <w:r>
-        <w:t xml:space="preserve"> </w:t>
-      </w:r>
-      <w:r>
-        <w:t xml:space="preserve">Niche</w:t>
-      </w:r>
-      <w:r>
-        <w:t xml:space="preserve"> </w:t>
-      </w:r>
-      <w:r>
-        <w:t xml:space="preserve">·</w:t>
-      </w:r>
-      <w:r>
-        <w:t xml:space="preserve"> </w:t>
-      </w:r>
-      <w:r>
-        <w:t xml:space="preserve">Episode:</w:t>
-      </w:r>
-      <w:r>
-        <w:t xml:space="preserve"> </w:t>
-      </w:r>
-      <w:r>
-        <w:t xml:space="preserve">The</w:t>
-      </w:r>
-      <w:r>
-        <w:t xml:space="preserve"> </w:t>
-      </w:r>
-      <w:r>
-        <w:t xml:space="preserve">Blood</w:t>
-      </w:r>
-      <w:r>
-        <w:t xml:space="preserve"> </w:t>
-      </w:r>
-      <w:r>
-        <w:t xml:space="preserve">of</w:t>
-      </w:r>
-      <w:r>
-        <w:t xml:space="preserve"> </w:t>
-      </w:r>
-      <w:r>
-        <w:t xml:space="preserve">Jesus</w:t>
-      </w:r>
-      <w:r>
-        <w:t xml:space="preserve"> </w:t>
-      </w:r>
-      <w:r>
-        <w:t xml:space="preserve">Over</w:t>
-      </w:r>
-      <w:r>
-        <w:t xml:space="preserve"> </w:t>
-      </w:r>
-      <w:r>
-        <w:t xml:space="preserve">Your</w:t>
-      </w:r>
-      <w:r>
-        <w:t xml:space="preserve"> </w:t>
-      </w:r>
-      <w:r>
-        <w:t xml:space="preserve">Home</w:t>
+        <w:t xml:space="preserve">Night Deliverance Prayer Niche · Episode: The Blood of Jesus Over Your Home</w:t>
       </w:r>
     </w:p>
     <w:p>
@@ -113,13 +23,7 @@
         <w:pStyle w:val="Date"/>
       </w:pPr>
       <w:r>
-        <w:t xml:space="preserve">October</w:t>
-      </w:r>
-      <w:r>
-        <w:t xml:space="preserve"> </w:t>
-      </w:r>
-      <w:r>
-        <w:t xml:space="preserve">2026</w:t>
+        <w:t xml:space="preserve">October 2026</w:t>
       </w:r>
     </w:p>
     <w:bookmarkStart w:id="20" w:name="contents"/>
@@ -290,13 +194,7 @@
         <w:pStyle w:val="FirstParagraph"/>
       </w:pPr>
       <w:r>
-        <w:t xml:space="preserve">Source channel studied: Daily Deliverance Prayer (</w:t>
-      </w:r>
-      <w:r>
-        <w:t xml:space="preserve">@DailyDeliverancePrayer</w:t>
-      </w:r>
-      <w:r>
-        <w:t xml:space="preserve">). The clone channel sells no products, ebooks or links.</w:t>
+        <w:t xml:space="preserve">Source channel studied: Daily Deliverance Prayer (@DailyDeliverancePrayer). The clone channel sells no products, ebooks or links.</w:t>
       </w:r>
     </w:p>
     <w:bookmarkStart w:id="21" w:name="channel-name-options"/>
@@ -329,7 +227,7 @@
         <w:pStyle w:val="Compact"/>
       </w:pPr>
       <w:r>
-        <w:t xml:space="preserve">Shielded Tonight Prayers</w:t>
+        <w:t xml:space="preserve">Shielded Tonight Prayers (chosen)</w:t>
       </w:r>
     </w:p>
     <w:p>
@@ -455,19 +353,7 @@
         <w:pStyle w:val="FirstParagraph"/>
       </w:pPr>
       <w:r>
-        <w:t xml:space="preserve">We hold on to Psalm 4:8:</w:t>
-      </w:r>
-      <w:r>
-        <w:t xml:space="preserve"> </w:t>
-      </w:r>
-      <w:r>
-        <w:t xml:space="preserve">“</w:t>
-      </w:r>
-      <w:r>
-        <w:t xml:space="preserve">I will both lay me down in peace, and sleep: for thou, Lord, only makest me dwell in safety.</w:t>
-      </w:r>
-      <w:r>
-        <w:t xml:space="preserve">”</w:t>
+        <w:t xml:space="preserve">We hold on to Psalm 4:8: “I will both lay me down in peace, and sleep: for thou, Lord, only makest me dwell in safety.”</w:t>
       </w:r>
     </w:p>
     <w:p>
@@ -493,7 +379,7 @@
         <w:pStyle w:val="Heading2"/>
       </w:pPr>
       <w:r>
-        <w:t xml:space="preserve">Channel Description: Option B</w:t>
+        <w:t xml:space="preserve">Channel Description: Option B (chosen channel)</w:t>
       </w:r>
     </w:p>
     <w:p>
@@ -573,19 +459,7 @@
         <w:pStyle w:val="FirstParagraph"/>
       </w:pPr>
       <w:r>
-        <w:t xml:space="preserve">Our anchor is Psalm 91:11:</w:t>
-      </w:r>
-      <w:r>
-        <w:t xml:space="preserve"> </w:t>
-      </w:r>
-      <w:r>
-        <w:t xml:space="preserve">“</w:t>
-      </w:r>
-      <w:r>
-        <w:t xml:space="preserve">For he shall give his angels charge over thee, to keep thee in all thy ways.</w:t>
-      </w:r>
-      <w:r>
-        <w:t xml:space="preserve">”</w:t>
+        <w:t xml:space="preserve">Our anchor is Psalm 91:11: “For he shall give his angels charge over thee, to keep thee in all thy ways.”</w:t>
       </w:r>
     </w:p>
     <w:p>
@@ -637,37 +511,7 @@
         <w:pStyle w:val="FirstParagraph"/>
       </w:pPr>
       <w:r>
-        <w:t xml:space="preserve">YouTube channel banner, 2560x1440, with all key content inside the central 1546x423 safe area. The scene is a serene twilight mountain lake under a deep navy-blue sky. Dark pine forests line both shores, mist hovers over still water, and faint stars show above. A soft golden heavenly glow rises from the horizon at the center and reflects as a shimmering path across the lake. Centered on the glow, elegant gold serif typography with a subtle metallic sheen and a gentle drop shadow reads</w:t>
-      </w:r>
-      <w:r>
-        <w:t xml:space="preserve"> </w:t>
-      </w:r>
-      <w:r>
-        <w:t xml:space="preserve">“</w:t>
-      </w:r>
-      <w:r>
-        <w:t xml:space="preserve">NIGHTLY COVERING PRAYER</w:t>
-      </w:r>
-      <w:r>
-        <w:t xml:space="preserve">”</w:t>
-      </w:r>
-      <w:r>
-        <w:t xml:space="preserve">. Below it, a smaller tagline in clean cream-white serif capitals with thin gold divider lines on each side reads</w:t>
-      </w:r>
-      <w:r>
-        <w:t xml:space="preserve"> </w:t>
-      </w:r>
-      <w:r>
-        <w:t xml:space="preserve">“</w:t>
-      </w:r>
-      <w:r>
-        <w:t xml:space="preserve">PRAY WITH US EVERY NIGHT • PROTECTION • PEACE • DELIVERANCE</w:t>
-      </w:r>
-      <w:r>
-        <w:t xml:space="preserve">”</w:t>
-      </w:r>
-      <w:r>
-        <w:t xml:space="preserve">. On the right of the safe area is a small glowing gold cross icon. The palette is midnight blue, deep teal, and warm gold. The mood is calm, sacred, protective, and peaceful, with cinematic lighting, photorealistic landscape, and high detail. The banner has no QR code, no book or product images, and no sales text.</w:t>
+        <w:t xml:space="preserve">YouTube channel banner, 2560x1440, with all key content inside the central 1546x423 safe area. The scene is a serene twilight mountain lake under a deep navy-blue sky. Dark pine forests line both shores, mist hovers over still water, and faint stars show above. A soft golden heavenly glow rises from the horizon at the center and reflects as a shimmering path across the lake. Centered on the glow, elegant gold serif typography with a subtle metallic sheen and a gentle drop shadow reads “SHIELDED TONIGHT PRAYERS”. Below it, a smaller tagline in clean cream-white serif capitals with thin gold divider lines on each side reads “PRAY WITH US EVERY NIGHT • PROTECTION • PEACE • DELIVERANCE”. On the right of the safe area is a small glowing gold cross icon. The palette is midnight blue, deep teal, and warm gold. The mood is calm, sacred, protective, and peaceful, with cinematic lighting, photorealistic landscape, and high detail. The banner has no QR code, no book or product images, and no sales text.</w:t>
       </w:r>
     </w:p>
     <w:bookmarkEnd w:id="25"/>
@@ -703,25 +547,7 @@
         <w:pStyle w:val="FirstParagraph"/>
       </w:pPr>
       <w:r>
-        <w:t xml:space="preserve">Night-time spiritual warfare and deliverance prayer in the Pentecostal and charismatic</w:t>
-      </w:r>
-      <w:r>
-        <w:t xml:space="preserve"> </w:t>
-      </w:r>
-      <w:r>
-        <w:t xml:space="preserve">“</w:t>
-      </w:r>
-      <w:r>
-        <w:t xml:space="preserve">fire prayer</w:t>
-      </w:r>
-      <w:r>
-        <w:t xml:space="preserve">”</w:t>
-      </w:r>
-      <w:r>
-        <w:t xml:space="preserve"> </w:t>
-      </w:r>
-      <w:r>
-        <w:t xml:space="preserve">tradition. The core motifs are the Blood of Jesus, fire, altars, arrows, returning attacks to the sender, and the courtroom of heaven. The vocabulary includes West African deliverance language (marine shrines, ancestral altars, monitoring spirits, astral projection). The videos are made to be played at bedtime, on a loop.</w:t>
+        <w:t xml:space="preserve">Night-time spiritual warfare and deliverance prayer in the Pentecostal and charismatic “fire prayer” tradition. The core motifs are the Blood of Jesus, fire, altars, arrows, returning attacks to the sender, and the courtroom of heaven. The vocabulary includes West African deliverance language (marine shrines, ancestral altars, monitoring spirits, astral projection). The videos are made to be played at bedtime, on a loop.</w:t>
       </w:r>
     </w:p>
     <w:bookmarkEnd w:id="27"/>
@@ -755,19 +581,7 @@
         <w:pStyle w:val="Compact"/>
       </w:pPr>
       <w:r>
-        <w:t xml:space="preserve">They are already struggling: anxiety, broken sleep, bad dreams, money that leaks away, family conflict,</w:t>
-      </w:r>
-      <w:r>
-        <w:t xml:space="preserve"> </w:t>
-      </w:r>
-      <w:r>
-        <w:t xml:space="preserve">“</w:t>
-      </w:r>
-      <w:r>
-        <w:t xml:space="preserve">delayed destiny.</w:t>
-      </w:r>
-      <w:r>
-        <w:t xml:space="preserve">”</w:t>
+        <w:t xml:space="preserve">They are already struggling: anxiety, broken sleep, bad dreams, money that leaks away, family conflict, “delayed destiny.”</w:t>
       </w:r>
     </w:p>
     <w:p>
@@ -828,28 +642,7 @@
         <w:t xml:space="preserve">Instant war cry:</w:t>
       </w:r>
       <w:r>
-        <w:t xml:space="preserve"> </w:t>
-      </w:r>
-      <w:r>
-        <w:t xml:space="preserve">first person, present tense, mid-battle.</w:t>
-      </w:r>
-      <w:r>
-        <w:t xml:space="preserve"> </w:t>
-      </w:r>
-      <w:r>
-        <w:t xml:space="preserve">“</w:t>
-      </w:r>
-      <w:r>
-        <w:t xml:space="preserve">Tonight I take my stand…</w:t>
-      </w:r>
-      <w:r>
-        <w:t xml:space="preserve">”</w:t>
-      </w:r>
-      <w:r>
-        <w:t xml:space="preserve"> </w:t>
-      </w:r>
-      <w:r>
-        <w:t xml:space="preserve">There is no greeting.</w:t>
+        <w:t xml:space="preserve"> first person, present tense, mid-battle. “Tonight I take my stand…” There is no greeting.</w:t>
       </w:r>
     </w:p>
     <w:p>
@@ -868,34 +661,7 @@
         <w:t xml:space="preserve">Reassurance flip:</w:t>
       </w:r>
       <w:r>
-        <w:t xml:space="preserve"> </w:t>
-      </w:r>
-      <w:r>
-        <w:t xml:space="preserve">second person. A run of negations (</w:t>
-      </w:r>
-      <w:r>
-        <w:t xml:space="preserve">“</w:t>
-      </w:r>
-      <w:r>
-        <w:t xml:space="preserve">You do not come uncertain…</w:t>
-      </w:r>
-      <w:r>
-        <w:t xml:space="preserve">”</w:t>
-      </w:r>
-      <w:r>
-        <w:t xml:space="preserve">) flips into affirmations (</w:t>
-      </w:r>
-      <w:r>
-        <w:t xml:space="preserve">“</w:t>
-      </w:r>
-      <w:r>
-        <w:t xml:space="preserve">Tonight you come covered.</w:t>
-      </w:r>
-      <w:r>
-        <w:t xml:space="preserve">”</w:t>
-      </w:r>
-      <w:r>
-        <w:t xml:space="preserve">).</w:t>
+        <w:t xml:space="preserve"> second person. A run of negations (“You do not come uncertain…”) flips into affirmations (“Tonight you come covered.”).</w:t>
       </w:r>
     </w:p>
     <w:p>
@@ -914,22 +680,7 @@
         <w:t xml:space="preserve">Sacred welcome and reframe:</w:t>
       </w:r>
       <w:r>
-        <w:t xml:space="preserve"> </w:t>
-      </w:r>
-      <w:r>
-        <w:t xml:space="preserve">a greeting followed by</w:t>
-      </w:r>
-      <w:r>
-        <w:t xml:space="preserve"> </w:t>
-      </w:r>
-      <w:r>
-        <w:t xml:space="preserve">“</w:t>
-      </w:r>
-      <w:r>
-        <w:t xml:space="preserve">This is not X. It is Y.</w:t>
-      </w:r>
-      <w:r>
-        <w:t xml:space="preserve">”</w:t>
+        <w:t xml:space="preserve"> a greeting followed by “This is not X. It is Y.”</w:t>
       </w:r>
     </w:p>
     <w:p>
@@ -937,25 +688,7 @@
         <w:pStyle w:val="FirstParagraph"/>
       </w:pPr>
       <w:r>
-        <w:t xml:space="preserve">Shared elements:</w:t>
-      </w:r>
-      <w:r>
-        <w:t xml:space="preserve"> </w:t>
-      </w:r>
-      <w:r>
-        <w:t xml:space="preserve">“</w:t>
-      </w:r>
-      <w:r>
-        <w:t xml:space="preserve">Tonight</w:t>
-      </w:r>
-      <w:r>
-        <w:t xml:space="preserve">”</w:t>
-      </w:r>
-      <w:r>
-        <w:t xml:space="preserve"> </w:t>
-      </w:r>
-      <w:r>
-        <w:t xml:space="preserve">comes first, the Blood is named within 2 sentences, the stakes are listed early (life, home, sleep, destiny), and an outcome is promised before the night ends.</w:t>
+        <w:t xml:space="preserve">Shared elements: “Tonight” comes first, the Blood is named within 2 sentences, the stakes are listed early (life, home, sleep, destiny), and an outcome is promised before the night ends.</w:t>
       </w:r>
     </w:p>
     <w:bookmarkEnd w:id="29"/>
@@ -980,10 +713,7 @@
         <w:t xml:space="preserve">Macro arc:</w:t>
       </w:r>
       <w:r>
-        <w:t xml:space="preserve"> </w:t>
-      </w:r>
-      <w:r>
-        <w:t xml:space="preserve">Covering, then altars burned, arrows reversed, night and dream gates sealed, bloodline broken, mind guarded, body and finances restored, angels deployed, a final verdict roll-call, restoration and peace, and the seal. Then the video loops back to the start.</w:t>
+        <w:t xml:space="preserve"> Covering, then altars burned, arrows reversed, night and dream gates sealed, bloodline broken, mind guarded, body and finances restored, angels deployed, a final verdict roll-call, restoration and peace, and the seal. Then the video loops back to the start.</w:t>
       </w:r>
     </w:p>
     <w:p>
@@ -1109,25 +839,7 @@
         <w:pStyle w:val="Compact"/>
       </w:pPr>
       <w:r>
-        <w:t xml:space="preserve">Base unit:</w:t>
-      </w:r>
-      <w:r>
-        <w:t xml:space="preserve"> </w:t>
-      </w:r>
-      <w:r>
-        <w:t xml:space="preserve">“</w:t>
-      </w:r>
-      <w:r>
-        <w:t xml:space="preserve">I + verb + object,</w:t>
-      </w:r>
-      <w:r>
-        <w:t xml:space="preserve">”</w:t>
-      </w:r>
-      <w:r>
-        <w:t xml:space="preserve"> </w:t>
-      </w:r>
-      <w:r>
-        <w:t xml:space="preserve">6 to 14 words, with no hedging.</w:t>
+        <w:t xml:space="preserve">Base unit: “I + verb + object,” 6 to 14 words, with no hedging.</w:t>
       </w:r>
     </w:p>
     <w:p>
@@ -1139,19 +851,7 @@
         <w:pStyle w:val="Compact"/>
       </w:pPr>
       <w:r>
-        <w:t xml:space="preserve">Anaphora in clusters of 3 to 5 (</w:t>
-      </w:r>
-      <w:r>
-        <w:t xml:space="preserve">“</w:t>
-      </w:r>
-      <w:r>
-        <w:t xml:space="preserve">I burn… I burn… I burn…</w:t>
-      </w:r>
-      <w:r>
-        <w:t xml:space="preserve">”</w:t>
-      </w:r>
-      <w:r>
-        <w:t xml:space="preserve">).</w:t>
+        <w:t xml:space="preserve">Anaphora in clusters of 3 to 5 (“I burn… I burn… I burn…”).</w:t>
       </w:r>
     </w:p>
     <w:p>
@@ -1175,19 +875,7 @@
         <w:pStyle w:val="Compact"/>
       </w:pPr>
       <w:r>
-        <w:t xml:space="preserve">Verdict fragments in the finale, with the verb dropped (</w:t>
-      </w:r>
-      <w:r>
-        <w:t xml:space="preserve">“</w:t>
-      </w:r>
-      <w:r>
-        <w:t xml:space="preserve">Altars speaking my name, judged.</w:t>
-      </w:r>
-      <w:r>
-        <w:t xml:space="preserve">”</w:t>
-      </w:r>
-      <w:r>
-        <w:t xml:space="preserve">).</w:t>
+        <w:t xml:space="preserve">Verdict fragments in the finale, with the verb dropped (“Altars speaking my name, judged.”).</w:t>
       </w:r>
     </w:p>
     <w:p>
@@ -1217,19 +905,7 @@
         <w:pStyle w:val="FirstParagraph"/>
       </w:pPr>
       <w:r>
-        <w:t xml:space="preserve">Militant, judicial and absolute. The prayers make decrees and never ask for anything. The intensity stays fierce for about 70 percent of the runtime, then cools deliberately into peace and rest for sleep. The teaching format adds pastoral warmth (</w:t>
-      </w:r>
-      <w:r>
-        <w:t xml:space="preserve">“</w:t>
-      </w:r>
-      <w:r>
-        <w:t xml:space="preserve">Beloved</w:t>
-      </w:r>
-      <w:r>
-        <w:t xml:space="preserve">”</w:t>
-      </w:r>
-      <w:r>
-        <w:t xml:space="preserve">).</w:t>
+        <w:t xml:space="preserve">Militant, judicial and absolute. The prayers make decrees and never ask for anything. The intensity stays fierce for about 70 percent of the runtime, then cools deliberately into peace and rest for sleep. The teaching format adds pastoral warmth (“Beloved”).</w:t>
       </w:r>
     </w:p>
     <w:bookmarkEnd w:id="32"/>
@@ -1263,49 +939,7 @@
         <w:pStyle w:val="Compact"/>
       </w:pPr>
       <w:r>
-        <w:t xml:space="preserve">Bridge phrases:</w:t>
-      </w:r>
-      <w:r>
-        <w:t xml:space="preserve"> </w:t>
-      </w:r>
-      <w:r>
-        <w:t xml:space="preserve">“</w:t>
-      </w:r>
-      <w:r>
-        <w:t xml:space="preserve">Now listen carefully…</w:t>
-      </w:r>
-      <w:r>
-        <w:t xml:space="preserve">”</w:t>
-      </w:r>
-      <w:r>
-        <w:t xml:space="preserve">,</w:t>
-      </w:r>
-      <w:r>
-        <w:t xml:space="preserve"> </w:t>
-      </w:r>
-      <w:r>
-        <w:t xml:space="preserve">“</w:t>
-      </w:r>
-      <w:r>
-        <w:t xml:space="preserve">Now hear this…</w:t>
-      </w:r>
-      <w:r>
-        <w:t xml:space="preserve">”</w:t>
-      </w:r>
-      <w:r>
-        <w:t xml:space="preserve">,</w:t>
-      </w:r>
-      <w:r>
-        <w:t xml:space="preserve"> </w:t>
-      </w:r>
-      <w:r>
-        <w:t xml:space="preserve">“</w:t>
-      </w:r>
-      <w:r>
-        <w:t xml:space="preserve">Now we enter the battlefield…</w:t>
-      </w:r>
-      <w:r>
-        <w:t xml:space="preserve">”</w:t>
+        <w:t xml:space="preserve">Bridge phrases: “Now listen carefully…”, “Now hear this…”, “Now we enter the battlefield…”</w:t>
       </w:r>
     </w:p>
     <w:p>
@@ -1329,19 +963,7 @@
         <w:pStyle w:val="Compact"/>
       </w:pPr>
       <w:r>
-        <w:t xml:space="preserve">Spatial or target pivots:</w:t>
-      </w:r>
-      <w:r>
-        <w:t xml:space="preserve"> </w:t>
-      </w:r>
-      <w:r>
-        <w:t xml:space="preserve">“</w:t>
-      </w:r>
-      <w:r>
-        <w:t xml:space="preserve">I now speak to my home…</w:t>
-      </w:r>
-      <w:r>
-        <w:t xml:space="preserve">”</w:t>
+        <w:t xml:space="preserve">Spatial or target pivots: “I now speak to my home…”</w:t>
       </w:r>
     </w:p>
     <w:p>
@@ -1387,19 +1009,7 @@
         <w:pStyle w:val="Compact"/>
       </w:pPr>
       <w:r>
-        <w:t xml:space="preserve">A hidden-cause hint (</w:t>
-      </w:r>
-      <w:r>
-        <w:t xml:space="preserve">“</w:t>
-      </w:r>
-      <w:r>
-        <w:t xml:space="preserve">There is a reason the enemy loves the midnight hours…</w:t>
-      </w:r>
-      <w:r>
-        <w:t xml:space="preserve">”</w:t>
-      </w:r>
-      <w:r>
-        <w:t xml:space="preserve">).</w:t>
+        <w:t xml:space="preserve">A hidden-cause hint (“There is a reason the enemy loves the midnight hours…”).</w:t>
       </w:r>
     </w:p>
     <w:p>
@@ -1453,31 +1063,7 @@
         <w:pStyle w:val="FirstParagraph"/>
       </w:pPr>
       <w:r>
-        <w:t xml:space="preserve">Fear validation through very specific symptoms, external blame, vindication and reversal, protection of family, legacy (</w:t>
-      </w:r>
-      <w:r>
-        <w:t xml:space="preserve">“</w:t>
-      </w:r>
-      <w:r>
-        <w:t xml:space="preserve">the curse ends with me</w:t>
-      </w:r>
-      <w:r>
-        <w:t xml:space="preserve">”</w:t>
-      </w:r>
-      <w:r>
-        <w:t xml:space="preserve">), identity (</w:t>
-      </w:r>
-      <w:r>
-        <w:t xml:space="preserve">“</w:t>
-      </w:r>
-      <w:r>
-        <w:t xml:space="preserve">I am not a victim</w:t>
-      </w:r>
-      <w:r>
-        <w:t xml:space="preserve">”</w:t>
-      </w:r>
-      <w:r>
-        <w:t xml:space="preserve">), and relief at the close.</w:t>
+        <w:t xml:space="preserve">Fear validation through very specific symptoms, external blame, vindication and reversal, protection of family, legacy (“the curse ends with me”), identity (“I am not a victim”), and relief at the close.</w:t>
       </w:r>
     </w:p>
     <w:bookmarkEnd w:id="35"/>
@@ -1495,19 +1081,7 @@
         <w:pStyle w:val="FirstParagraph"/>
       </w:pPr>
       <w:r>
-        <w:t xml:space="preserve">Full-cycle looping, numbered waves, call-and-response, comment calls-to-action embedded in the prayer (</w:t>
-      </w:r>
-      <w:r>
-        <w:t xml:space="preserve">“</w:t>
-      </w:r>
-      <w:r>
-        <w:t xml:space="preserve">Type…</w:t>
-      </w:r>
-      <w:r>
-        <w:t xml:space="preserve">”</w:t>
-      </w:r>
-      <w:r>
-        <w:t xml:space="preserve">), share calls-to-action, scripture callbacks like a chorus, escalation signposts, and habit framing.</w:t>
+        <w:t xml:space="preserve">Full-cycle looping, numbered waves, call-and-response, comment calls-to-action embedded in the prayer (“Type…”), share calls-to-action, scripture callbacks like a chorus, escalation signposts, and habit framing.</w:t>
       </w:r>
     </w:p>
     <w:bookmarkEnd w:id="36"/>
@@ -1541,69 +1115,10 @@
           <w:bCs/>
           <w:b/>
         </w:rPr>
-        <w:t xml:space="preserve">“</w:t>
-      </w:r>
-      <w:r>
-        <w:rPr>
-          <w:bCs/>
-          <w:b/>
-        </w:rPr>
-        <w:t xml:space="preserve">You</w:t>
-      </w:r>
-      <w:r>
-        <w:rPr>
-          <w:bCs/>
-          <w:b/>
-        </w:rPr>
-        <w:t xml:space="preserve">”</w:t>
-      </w:r>
-      <w:r>
-        <w:rPr>
-          <w:bCs/>
-          <w:b/>
-        </w:rPr>
-        <w:t xml:space="preserve"> </w:t>
-      </w:r>
-      <w:r>
-        <w:rPr>
-          <w:bCs/>
-          <w:b/>
-        </w:rPr>
-        <w:t xml:space="preserve">/</w:t>
-      </w:r>
-      <w:r>
-        <w:rPr>
-          <w:bCs/>
-          <w:b/>
-        </w:rPr>
-        <w:t xml:space="preserve"> </w:t>
-      </w:r>
-      <w:r>
-        <w:rPr>
-          <w:bCs/>
-          <w:b/>
-        </w:rPr>
-        <w:t xml:space="preserve">“</w:t>
-      </w:r>
-      <w:r>
-        <w:rPr>
-          <w:bCs/>
-          <w:b/>
-        </w:rPr>
-        <w:t xml:space="preserve">Beloved</w:t>
-      </w:r>
-      <w:r>
-        <w:rPr>
-          <w:bCs/>
-          <w:b/>
-        </w:rPr>
-        <w:t xml:space="preserve">”</w:t>
-      </w:r>
-      <w:r>
-        <w:t xml:space="preserve"> </w:t>
-      </w:r>
-      <w:r>
-        <w:t xml:space="preserve">to teach.</w:t>
+        <w:t xml:space="preserve">“You” / “Beloved”</w:t>
+      </w:r>
+      <w:r>
+        <w:t xml:space="preserve"> to teach.</w:t>
       </w:r>
     </w:p>
     <w:p>
@@ -1619,69 +1134,10 @@
           <w:bCs/>
           <w:b/>
         </w:rPr>
-        <w:t xml:space="preserve">“</w:t>
-      </w:r>
-      <w:r>
-        <w:rPr>
-          <w:bCs/>
-          <w:b/>
-        </w:rPr>
-        <w:t xml:space="preserve">We</w:t>
-      </w:r>
-      <w:r>
-        <w:rPr>
-          <w:bCs/>
-          <w:b/>
-        </w:rPr>
-        <w:t xml:space="preserve">”</w:t>
-      </w:r>
-      <w:r>
-        <w:rPr>
-          <w:bCs/>
-          <w:b/>
-        </w:rPr>
-        <w:t xml:space="preserve"> </w:t>
-      </w:r>
-      <w:r>
-        <w:rPr>
-          <w:bCs/>
-          <w:b/>
-        </w:rPr>
-        <w:t xml:space="preserve">/</w:t>
-      </w:r>
-      <w:r>
-        <w:rPr>
-          <w:bCs/>
-          <w:b/>
-        </w:rPr>
-        <w:t xml:space="preserve"> </w:t>
-      </w:r>
-      <w:r>
-        <w:rPr>
-          <w:bCs/>
-          <w:b/>
-        </w:rPr>
-        <w:t xml:space="preserve">“</w:t>
-      </w:r>
-      <w:r>
-        <w:rPr>
-          <w:bCs/>
-          <w:b/>
-        </w:rPr>
-        <w:t xml:space="preserve">this child of God</w:t>
-      </w:r>
-      <w:r>
-        <w:rPr>
-          <w:bCs/>
-          <w:b/>
-        </w:rPr>
-        <w:t xml:space="preserve">”</w:t>
-      </w:r>
-      <w:r>
-        <w:t xml:space="preserve"> </w:t>
-      </w:r>
-      <w:r>
-        <w:t xml:space="preserve">to intercede.</w:t>
+        <w:t xml:space="preserve">“We” / “this child of God”</w:t>
+      </w:r>
+      <w:r>
+        <w:t xml:space="preserve"> to intercede.</w:t>
       </w:r>
     </w:p>
     <w:p>
@@ -1697,69 +1153,10 @@
           <w:bCs/>
           <w:b/>
         </w:rPr>
-        <w:t xml:space="preserve">“</w:t>
-      </w:r>
-      <w:r>
-        <w:rPr>
-          <w:bCs/>
-          <w:b/>
-        </w:rPr>
-        <w:t xml:space="preserve">I</w:t>
-      </w:r>
-      <w:r>
-        <w:rPr>
-          <w:bCs/>
-          <w:b/>
-        </w:rPr>
-        <w:t xml:space="preserve">”</w:t>
-      </w:r>
-      <w:r>
-        <w:rPr>
-          <w:bCs/>
-          <w:b/>
-        </w:rPr>
-        <w:t xml:space="preserve"> </w:t>
-      </w:r>
-      <w:r>
-        <w:rPr>
-          <w:bCs/>
-          <w:b/>
-        </w:rPr>
-        <w:t xml:space="preserve">/</w:t>
-      </w:r>
-      <w:r>
-        <w:rPr>
-          <w:bCs/>
-          <w:b/>
-        </w:rPr>
-        <w:t xml:space="preserve"> </w:t>
-      </w:r>
-      <w:r>
-        <w:rPr>
-          <w:bCs/>
-          <w:b/>
-        </w:rPr>
-        <w:t xml:space="preserve">“</w:t>
-      </w:r>
-      <w:r>
-        <w:rPr>
-          <w:bCs/>
-          <w:b/>
-        </w:rPr>
-        <w:t xml:space="preserve">my</w:t>
-      </w:r>
-      <w:r>
-        <w:rPr>
-          <w:bCs/>
-          <w:b/>
-        </w:rPr>
-        <w:t xml:space="preserve">”</w:t>
-      </w:r>
-      <w:r>
-        <w:t xml:space="preserve"> </w:t>
-      </w:r>
-      <w:r>
-        <w:t xml:space="preserve">to declare.</w:t>
+        <w:t xml:space="preserve">“I” / “my”</w:t>
+      </w:r>
+      <w:r>
+        <w:t xml:space="preserve"> to declare.</w:t>
       </w:r>
     </w:p>
     <w:p>
@@ -1855,10 +1252,7 @@
         <w:t xml:space="preserve">The Blood of Jesus Over Your Home | Seal Every Door, Window and Gate Tonight</w:t>
       </w:r>
       <w:r>
-        <w:t xml:space="preserve"> </w:t>
-      </w:r>
-      <w:r>
-        <w:t xml:space="preserve">(selected)</w:t>
+        <w:t xml:space="preserve"> (selected)</w:t>
       </w:r>
     </w:p>
     <w:p>
@@ -3329,28 +2723,7 @@
         <w:t xml:space="preserve">Art style:</w:t>
       </w:r>
       <w:r>
-        <w:t xml:space="preserve"> </w:t>
-      </w:r>
-      <w:r>
-        <w:t xml:space="preserve">painterly digital illustration with cinematic realism, a</w:t>
-      </w:r>
-      <w:r>
-        <w:t xml:space="preserve"> </w:t>
-      </w:r>
-      <w:r>
-        <w:t xml:space="preserve">“</w:t>
-      </w:r>
-      <w:r>
-        <w:t xml:space="preserve">devotional concept art</w:t>
-      </w:r>
-      <w:r>
-        <w:t xml:space="preserve">”</w:t>
-      </w:r>
-      <w:r>
-        <w:t xml:space="preserve"> </w:t>
-      </w:r>
-      <w:r>
-        <w:t xml:space="preserve">look.</w:t>
+        <w:t xml:space="preserve"> painterly digital illustration with cinematic realism, a “devotional concept art” look.</w:t>
       </w:r>
     </w:p>
     <w:p>
@@ -3369,10 +2742,7 @@
         <w:t xml:space="preserve">Palette:</w:t>
       </w:r>
       <w:r>
-        <w:t xml:space="preserve"> </w:t>
-      </w:r>
-      <w:r>
-        <w:t xml:space="preserve">deep crimson, burnt orange, ember red and smoky maroon, with molten gold and amber highlights and near-black brown shadows. No cool tones.</w:t>
+        <w:t xml:space="preserve"> deep crimson, burnt orange, ember red and smoky maroon, with molten gold and amber highlights and near-black brown shadows. No cool tones.</w:t>
       </w:r>
     </w:p>
     <w:p>
@@ -3391,10 +2761,7 @@
         <w:t xml:space="preserve">Lighting:</w:t>
       </w:r>
       <w:r>
-        <w:t xml:space="preserve"> </w:t>
-      </w:r>
-      <w:r>
-        <w:t xml:space="preserve">one strong warm source, volumetric god rays through smoke, rim and backlight, a heavy vignette and strong chiaroscuro.</w:t>
+        <w:t xml:space="preserve"> one strong warm source, volumetric god rays through smoke, rim and backlight, a heavy vignette and strong chiaroscuro.</w:t>
       </w:r>
     </w:p>
     <w:p>
@@ -3413,10 +2780,7 @@
         <w:t xml:space="preserve">Camera:</w:t>
       </w:r>
       <w:r>
-        <w:t xml:space="preserve"> </w:t>
-      </w:r>
-      <w:r>
-        <w:t xml:space="preserve">static, at eye level or slightly low; medium shots for objects and wide shots for landscapes.</w:t>
+        <w:t xml:space="preserve"> static, at eye level or slightly low; medium shots for objects and wide shots for landscapes.</w:t>
       </w:r>
     </w:p>
     <w:p>
@@ -3435,10 +2799,7 @@
         <w:t xml:space="preserve">Composition:</w:t>
       </w:r>
       <w:r>
-        <w:t xml:space="preserve"> </w:t>
-      </w:r>
-      <w:r>
-        <w:t xml:space="preserve">a single focal subject, centered or on a third, with the lower 20 percent of the frame kept dark for captions and layers of smoke in front and behind.</w:t>
+        <w:t xml:space="preserve"> a single focal subject, centered or on a third, with the lower 20 percent of the frame kept dark for captions and layers of smoke in front and behind.</w:t>
       </w:r>
     </w:p>
     <w:p>
@@ -3457,10 +2818,7 @@
         <w:t xml:space="preserve">Detail:</w:t>
       </w:r>
       <w:r>
-        <w:t xml:space="preserve"> </w:t>
-      </w:r>
-      <w:r>
-        <w:t xml:space="preserve">high on the subject’s textures, soft in the background. A constant ember, ash and spark overlay is the signature texture.</w:t>
+        <w:t xml:space="preserve"> high on the subject’s textures, soft in the background. A constant ember, ash and spark overlay is the signature texture.</w:t>
       </w:r>
     </w:p>
     <w:p>
@@ -3479,10 +2837,7 @@
         <w:t xml:space="preserve">Mood:</w:t>
       </w:r>
       <w:r>
-        <w:t xml:space="preserve"> </w:t>
-      </w:r>
-      <w:r>
-        <w:t xml:space="preserve">sacred, solemn, protective and intense, warm rather than horror.</w:t>
+        <w:t xml:space="preserve"> sacred, solemn, protective and intense, warm rather than horror.</w:t>
       </w:r>
     </w:p>
     <w:p>
@@ -3501,10 +2856,7 @@
         <w:t xml:space="preserve">Edit layer:</w:t>
       </w:r>
       <w:r>
-        <w:t xml:space="preserve"> </w:t>
-      </w:r>
-      <w:r>
-        <w:t xml:space="preserve">bold white sans-serif captions at the bottom, an ember overlay, drifting smoke, and a slow push-in of 5 to 8 percent.</w:t>
+        <w:t xml:space="preserve"> bold white sans-serif captions at the bottom, an ember overlay, drifting smoke, and a slow push-in of 5 to 8 percent.</w:t>
       </w:r>
     </w:p>
     <w:p>
@@ -3519,10 +2871,7 @@
         <w:t xml:space="preserve">Locked style tag:</w:t>
       </w:r>
       <w:r>
-        <w:t xml:space="preserve"> </w:t>
-      </w:r>
-      <w:r>
-        <w:t xml:space="preserve">Cinematic devotional digital painting, painterly realism, sacred Christian concept art. Palette: deep crimson, burnt orange, ember red, smoky maroon, with molten gold and warm amber highlights and near-black brown shadows; no cool tones. Single dominant warm light source with volumetric god rays through drifting smoke, rim lighting, strong chiaroscuro, heavy dark vignette. Floating glowing embers and ash particles. Highly detailed subject, soft misty painterly background. Centered or rule-of-thirds composition, lower fifth of the frame dark and uncluttered. Eye-level or slightly low camera, shallow depth of field. Reverent, protective, solemn, powerful mood. 16:9, no text, no logos.</w:t>
+        <w:t xml:space="preserve"> Cinematic devotional digital painting, painterly realism, sacred Christian concept art. Palette: deep crimson, burnt orange, ember red, smoky maroon, with molten gold and warm amber highlights and near-black brown shadows; no cool tones. Single dominant warm light source with volumetric god rays through drifting smoke, rim lighting, strong chiaroscuro, heavy dark vignette. Floating glowing embers and ash particles. Highly detailed subject, soft misty painterly background. Centered or rule-of-thirds composition, lower fifth of the frame dark and uncluttered. Eye-level or slightly low camera, shallow depth of field. Reverent, protective, solemn, powerful mood. 16:9, no text, no logos.</w:t>
       </w:r>
     </w:p>
     <w:bookmarkEnd w:id="42"/>
@@ -3532,54 +2881,39 @@
         <w:pStyle w:val="Heading1"/>
       </w:pPr>
       <w:r>
+        <w:t xml:space="preserve">Image Prompt: “The Blood of Jesus Over Your Home”</w:t>
+      </w:r>
+    </w:p>
+    <w:p>
+      <w:pPr>
+        <w:pStyle w:val="FirstParagraph"/>
+      </w:pPr>
+      <w:r>
+        <w:t xml:space="preserve">Format: one background image for the whole video, matching the source channel. Motion, embers and captions are added in the edit.</w:t>
+      </w:r>
+    </w:p>
+    <w:bookmarkStart w:id="43" w:name="master-image-use-this-one"/>
+    <w:p>
+      <w:pPr>
+        <w:pStyle w:val="Heading2"/>
+      </w:pPr>
+      <w:r>
+        <w:t xml:space="preserve">MASTER IMAGE (use this one)</w:t>
+      </w:r>
+    </w:p>
+    <w:p>
+      <w:pPr>
+        <w:pStyle w:val="FirstParagraph"/>
+      </w:pPr>
+      <w:r>
+        <w:rPr>
+          <w:bCs/>
+          <w:b/>
+        </w:rPr>
         <w:t xml:space="preserve">Image Prompt:</w:t>
       </w:r>
       <w:r>
-        <w:t xml:space="preserve"> </w:t>
-      </w:r>
-      <w:r>
-        <w:t xml:space="preserve">“</w:t>
-      </w:r>
-      <w:r>
-        <w:t xml:space="preserve">The Blood of Jesus Over Your Home</w:t>
-      </w:r>
-      <w:r>
-        <w:t xml:space="preserve">”</w:t>
-      </w:r>
-    </w:p>
-    <w:p>
-      <w:pPr>
-        <w:pStyle w:val="FirstParagraph"/>
-      </w:pPr>
-      <w:r>
-        <w:t xml:space="preserve">Format: one background image for the whole video, matching the source channel. Motion, embers and captions are added in the edit.</w:t>
-      </w:r>
-    </w:p>
-    <w:bookmarkStart w:id="43" w:name="master-image-use-this-one"/>
-    <w:p>
-      <w:pPr>
-        <w:pStyle w:val="Heading2"/>
-      </w:pPr>
-      <w:r>
-        <w:t xml:space="preserve">MASTER IMAGE (use this one)</w:t>
-      </w:r>
-    </w:p>
-    <w:p>
-      <w:pPr>
-        <w:pStyle w:val="FirstParagraph"/>
-      </w:pPr>
-      <w:r>
-        <w:rPr>
-          <w:bCs/>
-          <w:b/>
-        </w:rPr>
-        <w:t xml:space="preserve">Image Prompt:</w:t>
-      </w:r>
-      <w:r>
-        <w:t xml:space="preserve"> </w:t>
-      </w:r>
-      <w:r>
-        <w:t xml:space="preserve">A heavy arched dark oak front door set in the old stone wall of a family home at night, its two side posts and upper lintel marked with streaks of glowing crimson blood that radiate molten gold light into the darkness. A simple cross shape glows softly through the grain at the center of the door. On the worn stone doorstep below sit a tall lit pillar candle with dripping red-orange wax and an old open leather-bound Bible with tooled gold edges. A thin scarlet cord hangs from a small arched window to the right of the door. Warm golden light leaks through the gap beneath the door. Drifting smoke curls across the threshold, and glowing embers and ash float through the air. Cinematic devotional digital painting, painterly realism, sacred Christian concept art. Palette of deep crimson, burnt orange, ember red and smoky maroon with molten gold and warm amber highlights and near-black brown shadows, no cool tones. A single dominant warm light source from the candle and the glowing doorposts, volumetric god rays through the smoke, rim lighting, strong chiaroscuro, heavy dark vignette. Highly detailed textures on the wood grain, wax drips, leather Bible and stone; soft misty painterly background. Centered symmetrical composition with the door as the single focal subject; lower fifth of the frame is the dark stone step, kept uncluttered for captions. Eye-level camera, slightly low, shallow depth of field. Reverent, protective, solemn and powerful mood. 16:9, 4K, no text, no logos, no watermark.</w:t>
+        <w:t xml:space="preserve"> A heavy arched dark oak front door set in the old stone wall of a family home at night, its two side posts and upper lintel marked with streaks of glowing crimson blood that radiate molten gold light into the darkness. A simple cross shape glows softly through the grain at the center of the door. On the worn stone doorstep below sit a tall lit pillar candle with dripping red-orange wax and an old open leather-bound Bible with tooled gold edges. A thin scarlet cord hangs from a small arched window to the right of the door. Warm golden light leaks through the gap beneath the door. Drifting smoke curls across the threshold, and glowing embers and ash float through the air. Cinematic devotional digital painting, painterly realism, sacred Christian concept art. Palette of deep crimson, burnt orange, ember red and smoky maroon with molten gold and warm amber highlights and near-black brown shadows, no cool tones. A single dominant warm light source from the candle and the glowing doorposts, volumetric god rays through the smoke, rim lighting, strong chiaroscuro, heavy dark vignette. Highly detailed textures on the wood grain, wax drips, leather Bible and stone; soft misty painterly background. Centered symmetrical composition with the door as the single focal subject; lower fifth of the frame is the dark stone step, kept uncluttered for captions. Eye-level camera, slightly low, shallow depth of field. Reverent, protective, solemn and powerful mood. 16:9, 4K, no text, no logos, no watermark.</w:t>
       </w:r>
     </w:p>
     <w:p>
@@ -3598,10 +2932,7 @@
         <w:t xml:space="preserve">Camera Angle:</w:t>
       </w:r>
       <w:r>
-        <w:t xml:space="preserve"> </w:t>
-      </w:r>
-      <w:r>
-        <w:t xml:space="preserve">Eye level, slightly low, centered and symmetrical</w:t>
+        <w:t xml:space="preserve"> Eye level, slightly low, centered and symmetrical</w:t>
       </w:r>
     </w:p>
     <w:p>
@@ -3620,10 +2951,7 @@
         <w:t xml:space="preserve">Lighting:</w:t>
       </w:r>
       <w:r>
-        <w:t xml:space="preserve"> </w:t>
-      </w:r>
-      <w:r>
-        <w:t xml:space="preserve">Candle and glowing crimson doorposts as the single warm source; gold light under the door; god rays through smoke</w:t>
+        <w:t xml:space="preserve"> Candle and glowing crimson doorposts as the single warm source; gold light under the door; god rays through smoke</w:t>
       </w:r>
     </w:p>
     <w:p>
@@ -3642,10 +2970,7 @@
         <w:t xml:space="preserve">Mood:</w:t>
       </w:r>
       <w:r>
-        <w:t xml:space="preserve"> </w:t>
-      </w:r>
-      <w:r>
-        <w:t xml:space="preserve">Reverent, protective, solemn, powerful</w:t>
+        <w:t xml:space="preserve"> Reverent, protective, solemn, powerful</w:t>
       </w:r>
     </w:p>
     <w:p>
@@ -3664,10 +2989,7 @@
         <w:t xml:space="preserve">Action:</w:t>
       </w:r>
       <w:r>
-        <w:t xml:space="preserve"> </w:t>
-      </w:r>
-      <w:r>
-        <w:t xml:space="preserve">Still scene. Candle flame, smoke and embers are the only motion, added in the edit</w:t>
+        <w:t xml:space="preserve"> Still scene. Candle flame, smoke and embers are the only motion, added in the edit</w:t>
       </w:r>
     </w:p>
     <w:bookmarkEnd w:id="43"/>
@@ -3784,19 +3106,115 @@
         <w:pStyle w:val="Heading1"/>
       </w:pPr>
       <w:r>
+        <w:t xml:space="preserve">Video Prompt: “The Blood of Jesus Over Your Home”</w:t>
+      </w:r>
+    </w:p>
+    <w:p>
+      <w:pPr>
+        <w:pStyle w:val="FirstParagraph"/>
+      </w:pPr>
+      <w:r>
+        <w:t xml:space="preserve">Use: image-to-video. Upload the generated master image as the start frame (and the end frame too, if the tool allows it, for a seamless loop). Generate one 8–10 second clip and loop it for the full video.</w:t>
+      </w:r>
+    </w:p>
+    <w:bookmarkStart w:id="48" w:name="master-video-prompt-for-the-master-image"/>
+    <w:p>
+      <w:pPr>
+        <w:pStyle w:val="Heading2"/>
+      </w:pPr>
+      <w:r>
+        <w:t xml:space="preserve">MASTER VIDEO PROMPT (for the master image)</w:t>
+      </w:r>
+    </w:p>
+    <w:p>
+      <w:pPr>
+        <w:pStyle w:val="FirstParagraph"/>
+      </w:pPr>
+      <w:r>
+        <w:rPr>
+          <w:bCs/>
+          <w:b/>
+        </w:rPr>
         <w:t xml:space="preserve">Video Prompt:</w:t>
       </w:r>
       <w:r>
-        <w:t xml:space="preserve"> </w:t>
-      </w:r>
-      <w:r>
-        <w:t xml:space="preserve">“</w:t>
-      </w:r>
-      <w:r>
-        <w:t xml:space="preserve">The Blood of Jesus Over Your Home</w:t>
-      </w:r>
-      <w:r>
-        <w:t xml:space="preserve">”</w:t>
+        <w:t xml:space="preserve"> Gentle, almost still cinematic motion on a sacred night scene. The candle flame on the stone doorstep flickers softly and sways, its warm light pulsing gently across the wood of the dark oak door. The crimson marks on the doorposts and lintel glow with a slow, steady breathing pulse of molten gold light, brightening and dimming over several seconds. The cross shape in the door glows faintly brighter in rhythm with the pulse. Thin smoke drifts slowly from left to right across the threshold and curls upward. Glowing embers and ash particles float upward and sideways through the air at a slow, calm pace. The scarlet cord in the window sways very slightly in a soft breeze. Warm golden light shimmers through the gap beneath the door. The camera holds almost still with an extremely slow push-in toward the door. No people, no sudden movement, no cuts. Reverent, peaceful, protective atmosphere. Painterly devotional art style preserved exactly; crimson, ember orange and molten gold palette; no cool tones.</w:t>
+      </w:r>
+    </w:p>
+    <w:p>
+      <w:pPr>
+        <w:numPr>
+          <w:ilvl w:val="0"/>
+          <w:numId w:val="1017"/>
+        </w:numPr>
+        <w:pStyle w:val="Compact"/>
+      </w:pPr>
+      <w:r>
+        <w:rPr>
+          <w:bCs/>
+          <w:b/>
+        </w:rPr>
+        <w:t xml:space="preserve">Camera Motion:</w:t>
+      </w:r>
+      <w:r>
+        <w:t xml:space="preserve"> Locked off with a very slow push-in of about 2 percent over the clip</w:t>
+      </w:r>
+    </w:p>
+    <w:p>
+      <w:pPr>
+        <w:numPr>
+          <w:ilvl w:val="0"/>
+          <w:numId w:val="1017"/>
+        </w:numPr>
+        <w:pStyle w:val="Compact"/>
+      </w:pPr>
+      <w:r>
+        <w:rPr>
+          <w:bCs/>
+          <w:b/>
+        </w:rPr>
+        <w:t xml:space="preserve">Motion Elements:</w:t>
+      </w:r>
+      <w:r>
+        <w:t xml:space="preserve"> Candle flicker, a pulsing glow on the doorposts, drifting smoke, rising embers, a slight sway of the cord, shimmering light under the door</w:t>
+      </w:r>
+    </w:p>
+    <w:p>
+      <w:pPr>
+        <w:numPr>
+          <w:ilvl w:val="0"/>
+          <w:numId w:val="1017"/>
+        </w:numPr>
+        <w:pStyle w:val="Compact"/>
+      </w:pPr>
+      <w:r>
+        <w:rPr>
+          <w:bCs/>
+          <w:b/>
+        </w:rPr>
+        <w:t xml:space="preserve">Speed:</w:t>
+      </w:r>
+      <w:r>
+        <w:t xml:space="preserve"> Slow and calm, suitable for sleep listening</w:t>
+      </w:r>
+    </w:p>
+    <w:p>
+      <w:pPr>
+        <w:numPr>
+          <w:ilvl w:val="0"/>
+          <w:numId w:val="1017"/>
+        </w:numPr>
+        <w:pStyle w:val="Compact"/>
+      </w:pPr>
+      <w:r>
+        <w:rPr>
+          <w:bCs/>
+          <w:b/>
+        </w:rPr>
+        <w:t xml:space="preserve">Duration:</w:t>
+      </w:r>
+      <w:r>
+        <w:t xml:space="preserve"> 8–10 seconds, looped</w:t>
       </w:r>
     </w:p>
     <w:p>
@@ -3804,129 +3222,6 @@
         <w:pStyle w:val="FirstParagraph"/>
       </w:pPr>
       <w:r>
-        <w:t xml:space="preserve">Use: image-to-video. Upload the generated master image as the start frame (and the end frame too, if the tool allows it, for a seamless loop). Generate one 8–10 second clip and loop it for the full video.</w:t>
-      </w:r>
-    </w:p>
-    <w:bookmarkStart w:id="48" w:name="master-video-prompt-for-the-master-image"/>
-    <w:p>
-      <w:pPr>
-        <w:pStyle w:val="Heading2"/>
-      </w:pPr>
-      <w:r>
-        <w:t xml:space="preserve">MASTER VIDEO PROMPT (for the master image)</w:t>
-      </w:r>
-    </w:p>
-    <w:p>
-      <w:pPr>
-        <w:pStyle w:val="FirstParagraph"/>
-      </w:pPr>
-      <w:r>
-        <w:rPr>
-          <w:bCs/>
-          <w:b/>
-        </w:rPr>
-        <w:t xml:space="preserve">Video Prompt:</w:t>
-      </w:r>
-      <w:r>
-        <w:t xml:space="preserve"> </w:t>
-      </w:r>
-      <w:r>
-        <w:t xml:space="preserve">Gentle, almost still cinematic motion on a sacred night scene. The candle flame on the stone doorstep flickers softly and sways, its warm light pulsing gently across the wood of the dark oak door. The crimson marks on the doorposts and lintel glow with a slow, steady breathing pulse of molten gold light, brightening and dimming over several seconds. The cross shape in the door glows faintly brighter in rhythm with the pulse. Thin smoke drifts slowly from left to right across the threshold and curls upward. Glowing embers and ash particles float upward and sideways through the air at a slow, calm pace. The scarlet cord in the window sways very slightly in a soft breeze. Warm golden light shimmers through the gap beneath the door. The camera holds almost still with an extremely slow push-in toward the door. No people, no sudden movement, no cuts. Reverent, peaceful, protective atmosphere. Painterly devotional art style preserved exactly; crimson, ember orange and molten gold palette; no cool tones.</w:t>
-      </w:r>
-    </w:p>
-    <w:p>
-      <w:pPr>
-        <w:numPr>
-          <w:ilvl w:val="0"/>
-          <w:numId w:val="1017"/>
-        </w:numPr>
-        <w:pStyle w:val="Compact"/>
-      </w:pPr>
-      <w:r>
-        <w:rPr>
-          <w:bCs/>
-          <w:b/>
-        </w:rPr>
-        <w:t xml:space="preserve">Camera Motion:</w:t>
-      </w:r>
-      <w:r>
-        <w:t xml:space="preserve"> </w:t>
-      </w:r>
-      <w:r>
-        <w:t xml:space="preserve">Locked off with a very slow push-in of about 2 percent over the clip</w:t>
-      </w:r>
-    </w:p>
-    <w:p>
-      <w:pPr>
-        <w:numPr>
-          <w:ilvl w:val="0"/>
-          <w:numId w:val="1017"/>
-        </w:numPr>
-        <w:pStyle w:val="Compact"/>
-      </w:pPr>
-      <w:r>
-        <w:rPr>
-          <w:bCs/>
-          <w:b/>
-        </w:rPr>
-        <w:t xml:space="preserve">Motion Elements:</w:t>
-      </w:r>
-      <w:r>
-        <w:t xml:space="preserve"> </w:t>
-      </w:r>
-      <w:r>
-        <w:t xml:space="preserve">Candle flicker, a pulsing glow on the doorposts, drifting smoke, rising embers, a slight sway of the cord, shimmering light under the door</w:t>
-      </w:r>
-    </w:p>
-    <w:p>
-      <w:pPr>
-        <w:numPr>
-          <w:ilvl w:val="0"/>
-          <w:numId w:val="1017"/>
-        </w:numPr>
-        <w:pStyle w:val="Compact"/>
-      </w:pPr>
-      <w:r>
-        <w:rPr>
-          <w:bCs/>
-          <w:b/>
-        </w:rPr>
-        <w:t xml:space="preserve">Speed:</w:t>
-      </w:r>
-      <w:r>
-        <w:t xml:space="preserve"> </w:t>
-      </w:r>
-      <w:r>
-        <w:t xml:space="preserve">Slow and calm, suitable for sleep listening</w:t>
-      </w:r>
-    </w:p>
-    <w:p>
-      <w:pPr>
-        <w:numPr>
-          <w:ilvl w:val="0"/>
-          <w:numId w:val="1017"/>
-        </w:numPr>
-        <w:pStyle w:val="Compact"/>
-      </w:pPr>
-      <w:r>
-        <w:rPr>
-          <w:bCs/>
-          <w:b/>
-        </w:rPr>
-        <w:t xml:space="preserve">Duration:</w:t>
-      </w:r>
-      <w:r>
-        <w:t xml:space="preserve"> </w:t>
-      </w:r>
-      <w:r>
-        <w:t xml:space="preserve">8–10 seconds, looped</w:t>
-      </w:r>
-    </w:p>
-    <w:p>
-      <w:pPr>
-        <w:pStyle w:val="FirstParagraph"/>
-      </w:pPr>
-      <w:r>
         <w:rPr>
           <w:bCs/>
           <w:b/>
@@ -3934,10 +3229,7 @@
         <w:t xml:space="preserve">Negative Prompt:</w:t>
       </w:r>
       <w:r>
-        <w:t xml:space="preserve"> </w:t>
-      </w:r>
-      <w:r>
-        <w:t xml:space="preserve">fast motion, camera shake, zoom bursts, door opening, people, faces, hands, morphing objects, melting shapes, flicker artifacts, strobing, color shift, blue tones, text, logos, watermark, low quality, distortion</w:t>
+        <w:t xml:space="preserve"> fast motion, camera shake, zoom bursts, door opening, people, faces, hands, morphing objects, melting shapes, flicker artifacts, strobing, color shift, blue tones, text, logos, watermark, low quality, distortion</w:t>
       </w:r>
     </w:p>
     <w:p>
@@ -3952,28 +3244,7 @@
         <w:t xml:space="preserve">Settings (most image-to-video tools):</w:t>
       </w:r>
       <w:r>
-        <w:t xml:space="preserve"> </w:t>
-      </w:r>
-      <w:r>
-        <w:t xml:space="preserve">- Aspect ratio 16:9, 1080p or higher</w:t>
-      </w:r>
-      <w:r>
-        <w:t xml:space="preserve"> </w:t>
-      </w:r>
-      <w:r>
-        <w:t xml:space="preserve">- Motion strength: low (about 2–3 out of 10)</w:t>
-      </w:r>
-      <w:r>
-        <w:t xml:space="preserve"> </w:t>
-      </w:r>
-      <w:r>
-        <w:t xml:space="preserve">- Creativity or prompt strength: low to keep the painting unchanged</w:t>
-      </w:r>
-      <w:r>
-        <w:t xml:space="preserve"> </w:t>
-      </w:r>
-      <w:r>
-        <w:t xml:space="preserve">- Use the same image as the start and end frame for a seamless loop</w:t>
+        <w:t xml:space="preserve"> - Aspect ratio 16:9, 1080p or higher - Motion strength: low (about 2–3 out of 10) - Creativity or prompt strength: low to keep the painting unchanged - Use the same image as the start and end frame for a seamless loop</w:t>
       </w:r>
     </w:p>
     <w:bookmarkEnd w:id="48"/>
@@ -4253,10 +3524,7 @@
         <w:t xml:space="preserve">Color contrast:</w:t>
       </w:r>
       <w:r>
-        <w:t xml:space="preserve"> </w:t>
-      </w:r>
-      <w:r>
-        <w:t xml:space="preserve">white and gold text against black on the left; fire orange, crimson and molten gold on the right, with a white-gold core behind each object. Almost always warm.</w:t>
+        <w:t xml:space="preserve"> white and gold text against black on the left; fire orange, crimson and molten gold on the right, with a white-gold core behind each object. Almost always warm.</w:t>
       </w:r>
     </w:p>
     <w:p>
@@ -4275,49 +3543,7 @@
         <w:t xml:space="preserve">Emotion triggers:</w:t>
       </w:r>
       <w:r>
-        <w:t xml:space="preserve"> </w:t>
-      </w:r>
-      <w:r>
-        <w:t xml:space="preserve">retaliation (</w:t>
-      </w:r>
-      <w:r>
-        <w:t xml:space="preserve">“</w:t>
-      </w:r>
-      <w:r>
-        <w:t xml:space="preserve">Return to Sender,</w:t>
-      </w:r>
-      <w:r>
-        <w:t xml:space="preserve">”</w:t>
-      </w:r>
-      <w:r>
-        <w:t xml:space="preserve"> </w:t>
-      </w:r>
-      <w:r>
-        <w:t xml:space="preserve">“</w:t>
-      </w:r>
-      <w:r>
-        <w:t xml:space="preserve">Doubled,</w:t>
-      </w:r>
-      <w:r>
-        <w:t xml:space="preserve">”</w:t>
-      </w:r>
-      <w:r>
-        <w:t xml:space="preserve"> </w:t>
-      </w:r>
-      <w:r>
-        <w:t xml:space="preserve">“</w:t>
-      </w:r>
-      <w:r>
-        <w:t xml:space="preserve">No Mercy,</w:t>
-      </w:r>
-      <w:r>
-        <w:t xml:space="preserve">”</w:t>
-      </w:r>
-      <w:r>
-        <w:t xml:space="preserve"> </w:t>
-      </w:r>
-      <w:r>
-        <w:t xml:space="preserve">the top performer at 623k views), superlatives, named threats (witchcraft, hexes, black magic), objects that signal a final ruling, a night-protection cue, and a template viewers recognize instantly.</w:t>
+        <w:t xml:space="preserve"> retaliation (“Return to Sender,” “Doubled,” “No Mercy,” the top performer at 623k views), superlatives, named threats (witchcraft, hexes, black magic), objects that signal a final ruling, a night-protection cue, and a template viewers recognize instantly.</w:t>
       </w:r>
     </w:p>
     <w:bookmarkEnd w:id="53"/>
@@ -4327,19 +3553,7 @@
         <w:pStyle w:val="Heading1"/>
       </w:pPr>
       <w:r>
-        <w:t xml:space="preserve">Thumbnails:</w:t>
-      </w:r>
-      <w:r>
-        <w:t xml:space="preserve"> </w:t>
-      </w:r>
-      <w:r>
-        <w:t xml:space="preserve">“</w:t>
-      </w:r>
-      <w:r>
-        <w:t xml:space="preserve">The Blood of Jesus Over Your Home</w:t>
-      </w:r>
-      <w:r>
-        <w:t xml:space="preserve">”</w:t>
+        <w:t xml:space="preserve">Thumbnails: “The Blood of Jesus Over Your Home”</w:t>
       </w:r>
     </w:p>
     <w:p>
@@ -4347,33 +3561,15 @@
         <w:pStyle w:val="FirstParagraph"/>
       </w:pPr>
       <w:r>
-        <w:t xml:space="preserve">How to build each one: generate the background art from the prompt (the left side is left dark and empty), then add the text in Canva or Photoshop using the shared text spec. If you use a generator that renders text well (Ideogram, GPT image), use the</w:t>
-      </w:r>
-      <w:r>
-        <w:t xml:space="preserve"> </w:t>
-      </w:r>
-      <w:r>
-        <w:t xml:space="preserve">“</w:t>
-      </w:r>
-      <w:r>
-        <w:t xml:space="preserve">All-in-one</w:t>
-      </w:r>
-      <w:r>
-        <w:t xml:space="preserve">”</w:t>
-      </w:r>
-      <w:r>
-        <w:t xml:space="preserve"> </w:t>
-      </w:r>
-      <w:r>
-        <w:t xml:space="preserve">line instead.</w:t>
-      </w:r>
-    </w:p>
-    <w:p>
-      <w:pPr>
-        <w:pStyle w:val="BodyText"/>
-      </w:pPr>
-      <w:r>
-        <w:t xml:space="preserve">The ribbon uses NIGHTLY COVERING PRAYER as a placeholder. Swap in whichever channel name you choose.</w:t>
+        <w:t xml:space="preserve">How to build each one: generate the background art from the prompt (the left side is left dark and empty), then add the text in Canva or Photoshop using the shared text spec. If you use a generator that renders text well (Ideogram, GPT image), use the “All-in-one” line instead.</w:t>
+      </w:r>
+    </w:p>
+    <w:p>
+      <w:pPr>
+        <w:pStyle w:val="BodyText"/>
+      </w:pPr>
+      <w:r>
+        <w:t xml:space="preserve">The ribbon carries the channel name, SHIELDED TONIGHT PRAYERS.</w:t>
       </w:r>
     </w:p>
     <w:bookmarkStart w:id="54" w:name="shared-text-spec-all-5"/>
@@ -4401,10 +3597,7 @@
         <w:t xml:space="preserve">Headline font:</w:t>
       </w:r>
       <w:r>
-        <w:t xml:space="preserve"> </w:t>
-      </w:r>
-      <w:r>
-        <w:t xml:space="preserve">Anton or Oswald Bold (condensed sans), or Playfair Display SC Black for the serif variant. All caps, tight leading.</w:t>
+        <w:t xml:space="preserve"> Anton or Oswald Bold (condensed sans), or Playfair Display SC Black for the serif variant. All caps, tight leading.</w:t>
       </w:r>
     </w:p>
     <w:p>
@@ -4423,10 +3616,7 @@
         <w:t xml:space="preserve">Headline line 1:</w:t>
       </w:r>
       <w:r>
-        <w:t xml:space="preserve"> </w:t>
-      </w:r>
-      <w:r>
-        <w:t xml:space="preserve">silver-white metallic with a subtle bevel, a 6–8 px dark stroke and a soft black outer glow.</w:t>
+        <w:t xml:space="preserve"> silver-white metallic with a subtle bevel, a 6–8 px dark stroke and a soft black outer glow.</w:t>
       </w:r>
     </w:p>
     <w:p>
@@ -4445,10 +3635,7 @@
         <w:t xml:space="preserve">Headline payoff line:</w:t>
       </w:r>
       <w:r>
-        <w:t xml:space="preserve"> </w:t>
-      </w:r>
-      <w:r>
-        <w:t xml:space="preserve">fire-gold gradient (#FFE7A0 at the top, then #F7B733, then #E2571E at the bottom) with a slight inner lava texture and the same stroke and glow.</w:t>
+        <w:t xml:space="preserve"> fire-gold gradient (#FFE7A0 at the top, then #F7B733, then #E2571E at the bottom) with a slight inner lava texture and the same stroke and glow.</w:t>
       </w:r>
     </w:p>
     <w:p>
@@ -4467,10 +3654,7 @@
         <w:t xml:space="preserve">Divider:</w:t>
       </w:r>
       <w:r>
-        <w:t xml:space="preserve"> </w:t>
-      </w:r>
-      <w:r>
-        <w:t xml:space="preserve">a small gold flourish with a center diamond between the headline and the subline.</w:t>
+        <w:t xml:space="preserve"> a small gold flourish with a center diamond between the headline and the subline.</w:t>
       </w:r>
     </w:p>
     <w:p>
@@ -4489,10 +3673,7 @@
         <w:t xml:space="preserve">Subline:</w:t>
       </w:r>
       <w:r>
-        <w:t xml:space="preserve"> </w:t>
-      </w:r>
-      <w:r>
-        <w:t xml:space="preserve">Oswald SemiBold in gold #F5C542 with a 4 px dark stroke, 3 lines, about 38% of the headline size.</w:t>
+        <w:t xml:space="preserve"> Oswald SemiBold in gold #F5C542 with a 4 px dark stroke, 3 lines, about 38% of the headline size.</w:t>
       </w:r>
     </w:p>
     <w:p>
@@ -4511,10 +3692,7 @@
         <w:t xml:space="preserve">Ribbon (optional):</w:t>
       </w:r>
       <w:r>
-        <w:t xml:space="preserve"> </w:t>
-      </w:r>
-      <w:r>
-        <w:t xml:space="preserve">channel name in spaced white small caps between gold scroll flourishes, under the subline.</w:t>
+        <w:t xml:space="preserve"> channel name in spaced white small caps between gold scroll flourishes, under the subline.</w:t>
       </w:r>
     </w:p>
     <w:p>
@@ -4533,10 +3711,7 @@
         <w:t xml:space="preserve">Layout:</w:t>
       </w:r>
       <w:r>
-        <w:t xml:space="preserve"> </w:t>
-      </w:r>
-      <w:r>
-        <w:t xml:space="preserve">the text block fills the left 55–60% of the frame. Keep the bottom-right 15% clear for the timestamp. Canvas is 1280×720.</w:t>
+        <w:t xml:space="preserve"> the text block fills the left 55–60% of the frame. Keep the bottom-right 15% clear for the timestamp. Canvas is 1280×720.</w:t>
       </w:r>
     </w:p>
     <w:p>
@@ -4572,10 +3747,7 @@
         <w:t xml:space="preserve">Visual Concept:</w:t>
       </w:r>
       <w:r>
-        <w:t xml:space="preserve"> </w:t>
-      </w:r>
-      <w:r>
-        <w:t xml:space="preserve">the master image, cropped close. A dark oak door on the right with glowing crimson doorposts, a cross glowing in the wood, a candle and an open Bible on the step.</w:t>
+        <w:t xml:space="preserve"> the master image, cropped close. A dark oak door on the right with glowing crimson doorposts, a cross glowing in the wood, a candle and an open Bible on the step.</w:t>
       </w:r>
     </w:p>
     <w:p>
@@ -4603,10 +3775,7 @@
         <w:pStyle w:val="Compact"/>
       </w:pPr>
       <w:r>
-        <w:t xml:space="preserve">Headline:</w:t>
-      </w:r>
-      <w:r>
-        <w:t xml:space="preserve"> </w:t>
+        <w:t xml:space="preserve">Headline: </w:t>
       </w:r>
       <w:r>
         <w:rPr>
@@ -4616,13 +3785,7 @@
         <w:t xml:space="preserve">BLOOD ON THE DOOR</w:t>
       </w:r>
       <w:r>
-        <w:t xml:space="preserve"> </w:t>
-      </w:r>
-      <w:r>
-        <w:t xml:space="preserve">(white) /</w:t>
-      </w:r>
-      <w:r>
-        <w:t xml:space="preserve"> </w:t>
+        <w:t xml:space="preserve"> (white) / </w:t>
       </w:r>
       <w:r>
         <w:rPr>
@@ -4632,10 +3795,7 @@
         <w:t xml:space="preserve">NOTHING EVIL ENTERS</w:t>
       </w:r>
       <w:r>
-        <w:t xml:space="preserve"> </w:t>
-      </w:r>
-      <w:r>
-        <w:t xml:space="preserve">(fire-gold)</w:t>
+        <w:t xml:space="preserve"> (fire-gold)</w:t>
       </w:r>
     </w:p>
     <w:p>
@@ -4659,7 +3819,7 @@
         <w:pStyle w:val="Compact"/>
       </w:pPr>
       <w:r>
-        <w:t xml:space="preserve">Ribbon: NIGHTLY COVERING PRAYER</w:t>
+        <w:t xml:space="preserve">Ribbon: SHIELDED TONIGHT PRAYERS</w:t>
       </w:r>
     </w:p>
     <w:p>
@@ -4678,10 +3838,7 @@
         <w:t xml:space="preserve">Emotion Trigger:</w:t>
       </w:r>
       <w:r>
-        <w:t xml:space="preserve"> </w:t>
-      </w:r>
-      <w:r>
-        <w:t xml:space="preserve">protection and authority. A clear promise that the home is sealed shut.</w:t>
+        <w:t xml:space="preserve"> protection and authority. A clear promise that the home is sealed shut.</w:t>
       </w:r>
     </w:p>
     <w:p>
@@ -4700,10 +3857,7 @@
         <w:t xml:space="preserve">Image Prompt:</w:t>
       </w:r>
       <w:r>
-        <w:t xml:space="preserve"> </w:t>
-      </w:r>
-      <w:r>
-        <w:t xml:space="preserve">YouTube thumbnail background, 16:9. On the right 45% of the frame, a heavy arched dark oak front door set in an old stone wall at night, angled slightly toward the viewer, its two doorposts and lintel streaked with glowing crimson blood radiating molten gold light, a cross shape blazing white-gold through the center of the door, a lit pillar candle with dripping wax and an old open leather-bound Bible on the stone doorstep, sparks and glowing embers bursting outward, fiery cracks of light in the stone around the frame. The left 55% of the frame fades to near-black smoky darkness and is completely empty, as negative space for text. High-contrast cinematic devotional digital art, painterly realism, deep crimson, fire orange and molten gold palette, intense backlight, strong chiaroscuro, heavy vignette, ultra-detailed, dramatic. No text, no letters, no logos.</w:t>
+        <w:t xml:space="preserve"> YouTube thumbnail background, 16:9. On the right 45% of the frame, a heavy arched dark oak front door set in an old stone wall at night, angled slightly toward the viewer, its two doorposts and lintel streaked with glowing crimson blood radiating molten gold light, a cross shape blazing white-gold through the center of the door, a lit pillar candle with dripping wax and an old open leather-bound Bible on the stone doorstep, sparks and glowing embers bursting outward, fiery cracks of light in the stone around the frame. The left 55% of the frame fades to near-black smoky darkness and is completely empty, as negative space for text. High-contrast cinematic devotional digital art, painterly realism, deep crimson, fire orange and molten gold palette, intense backlight, strong chiaroscuro, heavy vignette, ultra-detailed, dramatic. No text, no letters, no logos.</w:t>
       </w:r>
     </w:p>
     <w:p>
@@ -4722,61 +3876,7 @@
         <w:t xml:space="preserve">All-in-one (text-capable generators):</w:t>
       </w:r>
       <w:r>
-        <w:t xml:space="preserve"> </w:t>
-      </w:r>
-      <w:r>
-        <w:t xml:space="preserve">add: Left side bold condensed all-caps headline</w:t>
-      </w:r>
-      <w:r>
-        <w:t xml:space="preserve"> </w:t>
-      </w:r>
-      <w:r>
-        <w:t xml:space="preserve">“</w:t>
-      </w:r>
-      <w:r>
-        <w:t xml:space="preserve">BLOOD ON THE DOOR</w:t>
-      </w:r>
-      <w:r>
-        <w:t xml:space="preserve">”</w:t>
-      </w:r>
-      <w:r>
-        <w:t xml:space="preserve"> </w:t>
-      </w:r>
-      <w:r>
-        <w:t xml:space="preserve">in silver-white metallic and</w:t>
-      </w:r>
-      <w:r>
-        <w:t xml:space="preserve"> </w:t>
-      </w:r>
-      <w:r>
-        <w:t xml:space="preserve">“</w:t>
-      </w:r>
-      <w:r>
-        <w:t xml:space="preserve">NOTHING EVIL ENTERS</w:t>
-      </w:r>
-      <w:r>
-        <w:t xml:space="preserve">”</w:t>
-      </w:r>
-      <w:r>
-        <w:t xml:space="preserve"> </w:t>
-      </w:r>
-      <w:r>
-        <w:t xml:space="preserve">in fire-gold gradient, a small gold flourish divider, then gold subline</w:t>
-      </w:r>
-      <w:r>
-        <w:t xml:space="preserve"> </w:t>
-      </w:r>
-      <w:r>
-        <w:t xml:space="preserve">“</w:t>
-      </w:r>
-      <w:r>
-        <w:t xml:space="preserve">SEAL YOUR HOME, FAMILY &amp; SLEEP FROM WITCHCRAFT, NIGHT ATTACKS &amp; EVERY EVIL VISITOR</w:t>
-      </w:r>
-      <w:r>
-        <w:t xml:space="preserve">”</w:t>
-      </w:r>
-      <w:r>
-        <w:t xml:space="preserve">.</w:t>
+        <w:t xml:space="preserve"> add: Left side bold condensed all-caps headline “BLOOD ON THE DOOR” in silver-white metallic and “NOTHING EVIL ENTERS” in fire-gold gradient, a small gold flourish divider, then gold subline “SEAL YOUR HOME, FAMILY &amp; SLEEP FROM WITCHCRAFT, NIGHT ATTACKS &amp; EVERY EVIL VISITOR”.</w:t>
       </w:r>
     </w:p>
     <w:bookmarkEnd w:id="55"/>
@@ -4805,10 +3905,7 @@
         <w:t xml:space="preserve">Visual Concept:</w:t>
       </w:r>
       <w:r>
-        <w:t xml:space="preserve"> </w:t>
-      </w:r>
-      <w:r>
-        <w:t xml:space="preserve">a family house at night on the right, enclosed by a ring of fire, with a huge glowing cross in a break in the storm clouds pouring light onto the roof.</w:t>
+        <w:t xml:space="preserve"> a family house at night on the right, enclosed by a ring of fire, with a huge glowing cross in a break in the storm clouds pouring light onto the roof.</w:t>
       </w:r>
     </w:p>
     <w:p>
@@ -4836,10 +3933,7 @@
         <w:pStyle w:val="Compact"/>
       </w:pPr>
       <w:r>
-        <w:t xml:space="preserve">Headline:</w:t>
-      </w:r>
-      <w:r>
-        <w:t xml:space="preserve"> </w:t>
+        <w:t xml:space="preserve">Headline: </w:t>
       </w:r>
       <w:r>
         <w:rPr>
@@ -4849,13 +3943,7 @@
         <w:t xml:space="preserve">SEAL YOUR HOUSE</w:t>
       </w:r>
       <w:r>
-        <w:t xml:space="preserve"> </w:t>
-      </w:r>
-      <w:r>
-        <w:t xml:space="preserve">(white) /</w:t>
-      </w:r>
-      <w:r>
-        <w:t xml:space="preserve"> </w:t>
+        <w:t xml:space="preserve"> (white) / </w:t>
       </w:r>
       <w:r>
         <w:rPr>
@@ -4865,10 +3953,7 @@
         <w:t xml:space="preserve">TONIGHT</w:t>
       </w:r>
       <w:r>
-        <w:t xml:space="preserve"> </w:t>
-      </w:r>
-      <w:r>
-        <w:t xml:space="preserve">(fire-gold, largest word)</w:t>
+        <w:t xml:space="preserve"> (fire-gold, largest word)</w:t>
       </w:r>
     </w:p>
     <w:p>
@@ -4892,7 +3977,7 @@
         <w:pStyle w:val="Compact"/>
       </w:pPr>
       <w:r>
-        <w:t xml:space="preserve">Ribbon: NIGHTLY COVERING PRAYER</w:t>
+        <w:t xml:space="preserve">Ribbon: SHIELDED TONIGHT PRAYERS</w:t>
       </w:r>
     </w:p>
     <w:p>
@@ -4911,22 +3996,7 @@
         <w:t xml:space="preserve">Emotion Trigger:</w:t>
       </w:r>
       <w:r>
-        <w:t xml:space="preserve"> </w:t>
-      </w:r>
-      <w:r>
-        <w:t xml:space="preserve">urgency (</w:t>
-      </w:r>
-      <w:r>
-        <w:t xml:space="preserve">“</w:t>
-      </w:r>
-      <w:r>
-        <w:t xml:space="preserve">Tonight</w:t>
-      </w:r>
-      <w:r>
-        <w:t xml:space="preserve">”</w:t>
-      </w:r>
-      <w:r>
-        <w:t xml:space="preserve">) and safety for the whole family.</w:t>
+        <w:t xml:space="preserve"> urgency (“Tonight”) and safety for the whole family.</w:t>
       </w:r>
     </w:p>
     <w:p>
@@ -4945,10 +4015,7 @@
         <w:t xml:space="preserve">Image Prompt:</w:t>
       </w:r>
       <w:r>
-        <w:t xml:space="preserve"> </w:t>
-      </w:r>
-      <w:r>
-        <w:t xml:space="preserve">YouTube thumbnail background, 16:9. On the right 45% of the frame, a two-story stone-and-timber family house on a dark hill at night with warm glowing windows, surrounded by a blazing ring of fire along its property line, a massive rough-hewn wooden cross glowing white-gold in a break in crimson storm clouds directly above the roof, pouring intense golden god rays onto the house, red lightning cracking through the clouds, dark smoke at the edges stopped at the wall of fire, embers swirling. The left 55% of the frame fades to near-black and is completely empty, as negative space for text. High-contrast cinematic devotional digital art, painterly realism, crimson, fire orange and molten gold palette, dramatic backlight, heavy vignette, ultra-detailed. No text, no letters, no logos.</w:t>
+        <w:t xml:space="preserve"> YouTube thumbnail background, 16:9. On the right 45% of the frame, a two-story stone-and-timber family house on a dark hill at night with warm glowing windows, surrounded by a blazing ring of fire along its property line, a massive rough-hewn wooden cross glowing white-gold in a break in crimson storm clouds directly above the roof, pouring intense golden god rays onto the house, red lightning cracking through the clouds, dark smoke at the edges stopped at the wall of fire, embers swirling. The left 55% of the frame fades to near-black and is completely empty, as negative space for text. High-contrast cinematic devotional digital art, painterly realism, crimson, fire orange and molten gold palette, dramatic backlight, heavy vignette, ultra-detailed. No text, no letters, no logos.</w:t>
       </w:r>
     </w:p>
     <w:p>
@@ -4967,61 +4034,7 @@
         <w:t xml:space="preserve">All-in-one:</w:t>
       </w:r>
       <w:r>
-        <w:t xml:space="preserve"> </w:t>
-      </w:r>
-      <w:r>
-        <w:t xml:space="preserve">add: Left side headline</w:t>
-      </w:r>
-      <w:r>
-        <w:t xml:space="preserve"> </w:t>
-      </w:r>
-      <w:r>
-        <w:t xml:space="preserve">“</w:t>
-      </w:r>
-      <w:r>
-        <w:t xml:space="preserve">SEAL YOUR HOUSE</w:t>
-      </w:r>
-      <w:r>
-        <w:t xml:space="preserve">”</w:t>
-      </w:r>
-      <w:r>
-        <w:t xml:space="preserve"> </w:t>
-      </w:r>
-      <w:r>
-        <w:t xml:space="preserve">in silver-white metallic and</w:t>
-      </w:r>
-      <w:r>
-        <w:t xml:space="preserve"> </w:t>
-      </w:r>
-      <w:r>
-        <w:t xml:space="preserve">“</w:t>
-      </w:r>
-      <w:r>
-        <w:t xml:space="preserve">TONIGHT</w:t>
-      </w:r>
-      <w:r>
-        <w:t xml:space="preserve">”</w:t>
-      </w:r>
-      <w:r>
-        <w:t xml:space="preserve"> </w:t>
-      </w:r>
-      <w:r>
-        <w:t xml:space="preserve">in large fire-gold gradient, gold flourish divider, gold subline</w:t>
-      </w:r>
-      <w:r>
-        <w:t xml:space="preserve"> </w:t>
-      </w:r>
-      <w:r>
-        <w:t xml:space="preserve">“</w:t>
-      </w:r>
-      <w:r>
-        <w:t xml:space="preserve">BY THE BLOOD OF JESUS / DOORS, WINDOWS &amp; WALLS COVERED / AGAINST EVERY MIDNIGHT ATTACK</w:t>
-      </w:r>
-      <w:r>
-        <w:t xml:space="preserve">”</w:t>
-      </w:r>
-      <w:r>
-        <w:t xml:space="preserve">.</w:t>
+        <w:t xml:space="preserve"> add: Left side headline “SEAL YOUR HOUSE” in silver-white metallic and “TONIGHT” in large fire-gold gradient, gold flourish divider, gold subline “BY THE BLOOD OF JESUS / DOORS, WINDOWS &amp; WALLS COVERED / AGAINST EVERY MIDNIGHT ATTACK”.</w:t>
       </w:r>
     </w:p>
     <w:bookmarkEnd w:id="56"/>
@@ -5050,10 +4063,7 @@
         <w:t xml:space="preserve">Visual Concept:</w:t>
       </w:r>
       <w:r>
-        <w:t xml:space="preserve"> </w:t>
-      </w:r>
-      <w:r>
-        <w:t xml:space="preserve">dark arrows striking a blood-marked door and shattering, then flying back the way they came in streaks of fire. This is the source channel’s top-performing angle (retaliation), applied to the home.</w:t>
+        <w:t xml:space="preserve"> dark arrows striking a blood-marked door and shattering, then flying back the way they came in streaks of fire. This is the source channel’s top-performing angle (retaliation), applied to the home.</w:t>
       </w:r>
     </w:p>
     <w:p>
@@ -5081,10 +4091,7 @@
         <w:pStyle w:val="Compact"/>
       </w:pPr>
       <w:r>
-        <w:t xml:space="preserve">Headline:</w:t>
-      </w:r>
-      <w:r>
-        <w:t xml:space="preserve"> </w:t>
+        <w:t xml:space="preserve">Headline: </w:t>
       </w:r>
       <w:r>
         <w:rPr>
@@ -5094,13 +4101,7 @@
         <w:t xml:space="preserve">EVERY ATTACK ON YOUR HOME</w:t>
       </w:r>
       <w:r>
-        <w:t xml:space="preserve"> </w:t>
-      </w:r>
-      <w:r>
-        <w:t xml:space="preserve">(white, 2 lines) /</w:t>
-      </w:r>
-      <w:r>
-        <w:t xml:space="preserve"> </w:t>
+        <w:t xml:space="preserve"> (white, 2 lines) / </w:t>
       </w:r>
       <w:r>
         <w:rPr>
@@ -5110,10 +4111,7 @@
         <w:t xml:space="preserve">SENT BACK BY FIRE</w:t>
       </w:r>
       <w:r>
-        <w:t xml:space="preserve"> </w:t>
-      </w:r>
-      <w:r>
-        <w:t xml:space="preserve">(fire-gold)</w:t>
+        <w:t xml:space="preserve"> (fire-gold)</w:t>
       </w:r>
     </w:p>
     <w:p>
@@ -5137,7 +4135,7 @@
         <w:pStyle w:val="Compact"/>
       </w:pPr>
       <w:r>
-        <w:t xml:space="preserve">Ribbon: NIGHTLY COVERING PRAYER</w:t>
+        <w:t xml:space="preserve">Ribbon: SHIELDED TONIGHT PRAYERS</w:t>
       </w:r>
     </w:p>
     <w:p>
@@ -5156,10 +4154,7 @@
         <w:t xml:space="preserve">Emotion Trigger:</w:t>
       </w:r>
       <w:r>
-        <w:t xml:space="preserve"> </w:t>
-      </w:r>
-      <w:r>
-        <w:t xml:space="preserve">retaliation and justice. The attack returns to the sender.</w:t>
+        <w:t xml:space="preserve"> retaliation and justice. The attack returns to the sender.</w:t>
       </w:r>
     </w:p>
     <w:p>
@@ -5178,10 +4173,7 @@
         <w:t xml:space="preserve">Image Prompt:</w:t>
       </w:r>
       <w:r>
-        <w:t xml:space="preserve"> </w:t>
-      </w:r>
-      <w:r>
-        <w:t xml:space="preserve">YouTube thumbnail background, 16:9. On the right 45% of the frame, a dark oak front door with glowing crimson blood on its doorposts and a blazing white-gold cross at its center, black smoky arrows slamming into a shield of crimson light just in front of the door and shattering into bursts of sparks, several arrows reversing direction and flying back out of the frame trailing streaks of orange fire, cracked glowing stone around the door, red lightning, flying embers. The left 55% of the frame fades to near-black and is completely empty, as negative space for text. High-contrast cinematic devotional digital art, painterly realism, crimson, fire orange and molten gold palette, explosive energy, intense backlight, heavy vignette, ultra-detailed. No text, no letters, no logos.</w:t>
+        <w:t xml:space="preserve"> YouTube thumbnail background, 16:9. On the right 45% of the frame, a dark oak front door with glowing crimson blood on its doorposts and a blazing white-gold cross at its center, black smoky arrows slamming into a shield of crimson light just in front of the door and shattering into bursts of sparks, several arrows reversing direction and flying back out of the frame trailing streaks of orange fire, cracked glowing stone around the door, red lightning, flying embers. The left 55% of the frame fades to near-black and is completely empty, as negative space for text. High-contrast cinematic devotional digital art, painterly realism, crimson, fire orange and molten gold palette, explosive energy, intense backlight, heavy vignette, ultra-detailed. No text, no letters, no logos.</w:t>
       </w:r>
     </w:p>
     <w:p>
@@ -5200,61 +4192,7 @@
         <w:t xml:space="preserve">All-in-one:</w:t>
       </w:r>
       <w:r>
-        <w:t xml:space="preserve"> </w:t>
-      </w:r>
-      <w:r>
-        <w:t xml:space="preserve">add: Left side headline</w:t>
-      </w:r>
-      <w:r>
-        <w:t xml:space="preserve"> </w:t>
-      </w:r>
-      <w:r>
-        <w:t xml:space="preserve">“</w:t>
-      </w:r>
-      <w:r>
-        <w:t xml:space="preserve">EVERY ATTACK ON YOUR HOME</w:t>
-      </w:r>
-      <w:r>
-        <w:t xml:space="preserve">”</w:t>
-      </w:r>
-      <w:r>
-        <w:t xml:space="preserve"> </w:t>
-      </w:r>
-      <w:r>
-        <w:t xml:space="preserve">in silver-white metallic and</w:t>
-      </w:r>
-      <w:r>
-        <w:t xml:space="preserve"> </w:t>
-      </w:r>
-      <w:r>
-        <w:t xml:space="preserve">“</w:t>
-      </w:r>
-      <w:r>
-        <w:t xml:space="preserve">SENT BACK BY FIRE</w:t>
-      </w:r>
-      <w:r>
-        <w:t xml:space="preserve">”</w:t>
-      </w:r>
-      <w:r>
-        <w:t xml:space="preserve"> </w:t>
-      </w:r>
-      <w:r>
-        <w:t xml:space="preserve">in fire-gold gradient, gold flourish divider, gold subline</w:t>
-      </w:r>
-      <w:r>
-        <w:t xml:space="preserve"> </w:t>
-      </w:r>
-      <w:r>
-        <w:t xml:space="preserve">“</w:t>
-      </w:r>
-      <w:r>
-        <w:t xml:space="preserve">BREAK WITCHCRAFT, CURSES &amp; EVIL ALTARS AGAINST YOUR HOUSE, CHILDREN &amp; MARRIAGE</w:t>
-      </w:r>
-      <w:r>
-        <w:t xml:space="preserve">”</w:t>
-      </w:r>
-      <w:r>
-        <w:t xml:space="preserve">.</w:t>
+        <w:t xml:space="preserve"> add: Left side headline “EVERY ATTACK ON YOUR HOME” in silver-white metallic and “SENT BACK BY FIRE” in fire-gold gradient, gold flourish divider, gold subline “BREAK WITCHCRAFT, CURSES &amp; EVIL ALTARS AGAINST YOUR HOUSE, CHILDREN &amp; MARRIAGE”.</w:t>
       </w:r>
     </w:p>
     <w:bookmarkEnd w:id="57"/>
@@ -5283,10 +4221,7 @@
         <w:t xml:space="preserve">Visual Concept:</w:t>
       </w:r>
       <w:r>
-        <w:t xml:space="preserve"> </w:t>
-      </w:r>
-      <w:r>
-        <w:t xml:space="preserve">a towering dark smoke shadow with clawed edges stopped dead at a doorway glowing with crimson blood. It’s the Passover image, built to spark curiosity.</w:t>
+        <w:t xml:space="preserve"> a towering dark smoke shadow with clawed edges stopped dead at a doorway glowing with crimson blood. It’s the Passover image, built to spark curiosity.</w:t>
       </w:r>
     </w:p>
     <w:p>
@@ -5314,10 +4249,7 @@
         <w:pStyle w:val="Compact"/>
       </w:pPr>
       <w:r>
-        <w:t xml:space="preserve">Headline:</w:t>
-      </w:r>
-      <w:r>
-        <w:t xml:space="preserve"> </w:t>
+        <w:t xml:space="preserve">Headline: </w:t>
       </w:r>
       <w:r>
         <w:rPr>
@@ -5327,13 +4259,7 @@
         <w:t xml:space="preserve">THE DESTROYER</w:t>
       </w:r>
       <w:r>
-        <w:t xml:space="preserve"> </w:t>
-      </w:r>
-      <w:r>
-        <w:t xml:space="preserve">(white) /</w:t>
-      </w:r>
-      <w:r>
-        <w:t xml:space="preserve"> </w:t>
+        <w:t xml:space="preserve"> (white) / </w:t>
       </w:r>
       <w:r>
         <w:rPr>
@@ -5343,10 +4269,7 @@
         <w:t xml:space="preserve">CANNOT ENTER</w:t>
       </w:r>
       <w:r>
-        <w:t xml:space="preserve"> </w:t>
-      </w:r>
-      <w:r>
-        <w:t xml:space="preserve">(fire-gold)</w:t>
+        <w:t xml:space="preserve"> (fire-gold)</w:t>
       </w:r>
     </w:p>
     <w:p>
@@ -5370,7 +4293,7 @@
         <w:pStyle w:val="Compact"/>
       </w:pPr>
       <w:r>
-        <w:t xml:space="preserve">Ribbon: NIGHTLY COVERING PRAYER</w:t>
+        <w:t xml:space="preserve">Ribbon: SHIELDED TONIGHT PRAYERS</w:t>
       </w:r>
     </w:p>
     <w:p>
@@ -5389,28 +4312,7 @@
         <w:t xml:space="preserve">Emotion Trigger:</w:t>
       </w:r>
       <w:r>
-        <w:t xml:space="preserve"> </w:t>
-      </w:r>
-      <w:r>
-        <w:t xml:space="preserve">fear named and then overcome. Curiosity about</w:t>
-      </w:r>
-      <w:r>
-        <w:t xml:space="preserve"> </w:t>
-      </w:r>
-      <w:r>
-        <w:t xml:space="preserve">“</w:t>
-      </w:r>
-      <w:r>
-        <w:t xml:space="preserve">the destroyer,</w:t>
-      </w:r>
-      <w:r>
-        <w:t xml:space="preserve">”</w:t>
-      </w:r>
-      <w:r>
-        <w:t xml:space="preserve"> </w:t>
-      </w:r>
-      <w:r>
-        <w:t xml:space="preserve">with the promise of safety.</w:t>
+        <w:t xml:space="preserve"> fear named and then overcome. Curiosity about “the destroyer,” with the promise of safety.</w:t>
       </w:r>
     </w:p>
     <w:p>
@@ -5429,10 +4331,7 @@
         <w:t xml:space="preserve">Image Prompt:</w:t>
       </w:r>
       <w:r>
-        <w:t xml:space="preserve"> </w:t>
-      </w:r>
-      <w:r>
-        <w:t xml:space="preserve">YouTube thumbnail background, 16:9. On the right 45% of the frame, an ancient-style wooden doorway at night with its side posts and lintel marked in glowing crimson blood that radiates molten gold light, a towering dark shadow of smoke with clawed edges looming just outside the threshold but recoiling and breaking apart where it touches the light, warm golden light spilling from the gap under the door, a white lamb silhouette faintly glowing on the step, sparks and embers in the air. The left 55% of the frame fades to near-black and is completely empty, as negative space for text. High-contrast cinematic devotional digital art, painterly realism, crimson, ember orange and molten gold palette, dramatic tension, intense backlight, heavy vignette, ultra-detailed. No text, no letters, no logos.</w:t>
+        <w:t xml:space="preserve"> YouTube thumbnail background, 16:9. On the right 45% of the frame, an ancient-style wooden doorway at night with its side posts and lintel marked in glowing crimson blood that radiates molten gold light, a towering dark shadow of smoke with clawed edges looming just outside the threshold but recoiling and breaking apart where it touches the light, warm golden light spilling from the gap under the door, a white lamb silhouette faintly glowing on the step, sparks and embers in the air. The left 55% of the frame fades to near-black and is completely empty, as negative space for text. High-contrast cinematic devotional digital art, painterly realism, crimson, ember orange and molten gold palette, dramatic tension, intense backlight, heavy vignette, ultra-detailed. No text, no letters, no logos.</w:t>
       </w:r>
     </w:p>
     <w:p>
@@ -5451,61 +4350,7 @@
         <w:t xml:space="preserve">All-in-one:</w:t>
       </w:r>
       <w:r>
-        <w:t xml:space="preserve"> </w:t>
-      </w:r>
-      <w:r>
-        <w:t xml:space="preserve">add: Left side headline</w:t>
-      </w:r>
-      <w:r>
-        <w:t xml:space="preserve"> </w:t>
-      </w:r>
-      <w:r>
-        <w:t xml:space="preserve">“</w:t>
-      </w:r>
-      <w:r>
-        <w:t xml:space="preserve">THE DESTROYER</w:t>
-      </w:r>
-      <w:r>
-        <w:t xml:space="preserve">”</w:t>
-      </w:r>
-      <w:r>
-        <w:t xml:space="preserve"> </w:t>
-      </w:r>
-      <w:r>
-        <w:t xml:space="preserve">in silver-white metallic and</w:t>
-      </w:r>
-      <w:r>
-        <w:t xml:space="preserve"> </w:t>
-      </w:r>
-      <w:r>
-        <w:t xml:space="preserve">“</w:t>
-      </w:r>
-      <w:r>
-        <w:t xml:space="preserve">CANNOT ENTER</w:t>
-      </w:r>
-      <w:r>
-        <w:t xml:space="preserve">”</w:t>
-      </w:r>
-      <w:r>
-        <w:t xml:space="preserve"> </w:t>
-      </w:r>
-      <w:r>
-        <w:t xml:space="preserve">in fire-gold gradient, gold flourish divider, gold subline</w:t>
-      </w:r>
-      <w:r>
-        <w:t xml:space="preserve"> </w:t>
-      </w:r>
-      <w:r>
-        <w:t xml:space="preserve">“</w:t>
-      </w:r>
-      <w:r>
-        <w:t xml:space="preserve">PASSOVER PROTECTION PRAYER OVER YOUR HOME, CHILDREN &amp; SLEEP</w:t>
-      </w:r>
-      <w:r>
-        <w:t xml:space="preserve">”</w:t>
-      </w:r>
-      <w:r>
-        <w:t xml:space="preserve">.</w:t>
+        <w:t xml:space="preserve"> add: Left side headline “THE DESTROYER” in silver-white metallic and “CANNOT ENTER” in fire-gold gradient, gold flourish divider, gold subline “PASSOVER PROTECTION PRAYER OVER YOUR HOME, CHILDREN &amp; SLEEP”.</w:t>
       </w:r>
     </w:p>
     <w:bookmarkEnd w:id="58"/>
@@ -5534,10 +4379,7 @@
         <w:t xml:space="preserve">Visual Concept:</w:t>
       </w:r>
       <w:r>
-        <w:t xml:space="preserve"> </w:t>
-      </w:r>
-      <w:r>
-        <w:t xml:space="preserve">a flaming sword planted upright in front of a glowing house, with vast wings of fire rising behind it and chariots of fire faintly visible on the hills. It suggests an angel guard without showing a face.</w:t>
+        <w:t xml:space="preserve"> a flaming sword planted upright in front of a glowing house, with vast wings of fire rising behind it and chariots of fire faintly visible on the hills. It suggests an angel guard without showing a face.</w:t>
       </w:r>
     </w:p>
     <w:p>
@@ -5565,10 +4407,7 @@
         <w:pStyle w:val="Compact"/>
       </w:pPr>
       <w:r>
-        <w:t xml:space="preserve">Headline:</w:t>
-      </w:r>
-      <w:r>
-        <w:t xml:space="preserve"> </w:t>
+        <w:t xml:space="preserve">Headline: </w:t>
       </w:r>
       <w:r>
         <w:rPr>
@@ -5578,13 +4417,7 @@
         <w:t xml:space="preserve">ANGELS AROUND</w:t>
       </w:r>
       <w:r>
-        <w:t xml:space="preserve"> </w:t>
-      </w:r>
-      <w:r>
-        <w:t xml:space="preserve">(white) /</w:t>
-      </w:r>
-      <w:r>
-        <w:t xml:space="preserve"> </w:t>
+        <w:t xml:space="preserve"> (white) / </w:t>
       </w:r>
       <w:r>
         <w:rPr>
@@ -5594,10 +4427,7 @@
         <w:t xml:space="preserve">YOUR HOUSE</w:t>
       </w:r>
       <w:r>
-        <w:t xml:space="preserve"> </w:t>
-      </w:r>
-      <w:r>
-        <w:t xml:space="preserve">(fire-gold)</w:t>
+        <w:t xml:space="preserve"> (fire-gold)</w:t>
       </w:r>
     </w:p>
     <w:p>
@@ -5621,7 +4451,7 @@
         <w:pStyle w:val="Compact"/>
       </w:pPr>
       <w:r>
-        <w:t xml:space="preserve">Ribbon: NIGHTLY COVERING PRAYER</w:t>
+        <w:t xml:space="preserve">Ribbon: SHIELDED TONIGHT PRAYERS</w:t>
       </w:r>
     </w:p>
     <w:p>
@@ -5640,10 +4470,7 @@
         <w:t xml:space="preserve">Emotion Trigger:</w:t>
       </w:r>
       <w:r>
-        <w:t xml:space="preserve"> </w:t>
-      </w:r>
-      <w:r>
-        <w:t xml:space="preserve">awe and comfort. The viewer is not alone at night.</w:t>
+        <w:t xml:space="preserve"> awe and comfort. The viewer is not alone at night.</w:t>
       </w:r>
     </w:p>
     <w:p>
@@ -5662,10 +4489,7 @@
         <w:t xml:space="preserve">Image Prompt:</w:t>
       </w:r>
       <w:r>
-        <w:t xml:space="preserve"> </w:t>
-      </w:r>
-      <w:r>
-        <w:t xml:space="preserve">YouTube thumbnail background, 16:9. On the right 45% of the frame, a huge glowing sword of fire planted point-down in the ground in front of a stone family house at night, immense wings made of golden flame rising behind the sword, faint horses and chariots of fire lining the dark hills behind the house, a radiant white-gold light burst at the sword’s hilt, crimson storm clouds parting, embers swirling. The left 55% of the frame fades to near-black and is completely empty, as negative space for text. High-contrast cinematic devotional digital art, painterly realism, crimson, fire orange and molten gold palette, majestic and powerful, intense backlight, heavy vignette, ultra-detailed. No text, no letters, no logos, no faces.</w:t>
+        <w:t xml:space="preserve"> YouTube thumbnail background, 16:9. On the right 45% of the frame, a huge glowing sword of fire planted point-down in the ground in front of a stone family house at night, immense wings made of golden flame rising behind the sword, faint horses and chariots of fire lining the dark hills behind the house, a radiant white-gold light burst at the sword’s hilt, crimson storm clouds parting, embers swirling. The left 55% of the frame fades to near-black and is completely empty, as negative space for text. High-contrast cinematic devotional digital art, painterly realism, crimson, fire orange and molten gold palette, majestic and powerful, intense backlight, heavy vignette, ultra-detailed. No text, no letters, no logos, no faces.</w:t>
       </w:r>
     </w:p>
     <w:p>
@@ -5684,61 +4508,7 @@
         <w:t xml:space="preserve">All-in-one:</w:t>
       </w:r>
       <w:r>
-        <w:t xml:space="preserve"> </w:t>
-      </w:r>
-      <w:r>
-        <w:t xml:space="preserve">add: Left side headline</w:t>
-      </w:r>
-      <w:r>
-        <w:t xml:space="preserve"> </w:t>
-      </w:r>
-      <w:r>
-        <w:t xml:space="preserve">“</w:t>
-      </w:r>
-      <w:r>
-        <w:t xml:space="preserve">ANGELS AROUND</w:t>
-      </w:r>
-      <w:r>
-        <w:t xml:space="preserve">”</w:t>
-      </w:r>
-      <w:r>
-        <w:t xml:space="preserve"> </w:t>
-      </w:r>
-      <w:r>
-        <w:t xml:space="preserve">in silver-white metallic and</w:t>
-      </w:r>
-      <w:r>
-        <w:t xml:space="preserve"> </w:t>
-      </w:r>
-      <w:r>
-        <w:t xml:space="preserve">“</w:t>
-      </w:r>
-      <w:r>
-        <w:t xml:space="preserve">YOUR HOUSE</w:t>
-      </w:r>
-      <w:r>
-        <w:t xml:space="preserve">”</w:t>
-      </w:r>
-      <w:r>
-        <w:t xml:space="preserve"> </w:t>
-      </w:r>
-      <w:r>
-        <w:t xml:space="preserve">in fire-gold gradient, gold flourish divider, gold subline</w:t>
-      </w:r>
-      <w:r>
-        <w:t xml:space="preserve"> </w:t>
-      </w:r>
-      <w:r>
-        <w:t xml:space="preserve">“</w:t>
-      </w:r>
-      <w:r>
-        <w:t xml:space="preserve">CHARIOTS OF FIRE GUARD YOUR HOME / BLOCK EVERY NIGHT ATTACK / &amp; SLEEP IN PEACE TONIGHT</w:t>
-      </w:r>
-      <w:r>
-        <w:t xml:space="preserve">”</w:t>
-      </w:r>
-      <w:r>
-        <w:t xml:space="preserve">.</w:t>
+        <w:t xml:space="preserve"> add: Left side headline “ANGELS AROUND” in silver-white metallic and “YOUR HOUSE” in fire-gold gradient, gold flourish divider, gold subline “CHARIOTS OF FIRE GUARD YOUR HOME / BLOCK EVERY NIGHT ATTACK / &amp; SLEEP IN PEACE TONIGHT”.</w:t>
       </w:r>
     </w:p>
     <w:p>
@@ -5774,10 +4544,7 @@
         <w:t xml:space="preserve">Lead thumbnail:</w:t>
       </w:r>
       <w:r>
-        <w:t xml:space="preserve"> </w:t>
-      </w:r>
-      <w:r>
-        <w:t xml:space="preserve">#3 SENT BACK BY FIRE. It uses the source channel’s proven retaliation angle.</w:t>
+        <w:t xml:space="preserve"> #3 SENT BACK BY FIRE. It uses the source channel’s proven retaliation angle.</w:t>
       </w:r>
     </w:p>
     <w:p>
@@ -5796,10 +4563,7 @@
         <w:t xml:space="preserve">A/B test it against:</w:t>
       </w:r>
       <w:r>
-        <w:t xml:space="preserve"> </w:t>
-      </w:r>
-      <w:r>
-        <w:t xml:space="preserve">#1 BLOOD ON THE DOOR. It matches the video image, which gives visual continuity.</w:t>
+        <w:t xml:space="preserve"> #1 BLOOD ON THE DOOR. It matches the video image, which gives visual continuity.</w:t>
       </w:r>
     </w:p>
     <w:p>
@@ -5818,10 +4582,7 @@
         <w:t xml:space="preserve">Suggested title for #3:</w:t>
       </w:r>
       <w:r>
-        <w:t xml:space="preserve"> </w:t>
-      </w:r>
-      <w:r>
-        <w:t xml:space="preserve">Every Attack on Your Home Sent Back by Fire | Blood of Jesus Night Covering Prayer</w:t>
+        <w:t xml:space="preserve"> Every Attack on Your Home Sent Back by Fire | Blood of Jesus Night Covering Prayer</w:t>
       </w:r>
     </w:p>
     <w:p>
@@ -5840,10 +4601,7 @@
         <w:t xml:space="preserve">Suggested title for #1:</w:t>
       </w:r>
       <w:r>
-        <w:t xml:space="preserve"> </w:t>
-      </w:r>
-      <w:r>
-        <w:t xml:space="preserve">Blood on the Door: Nothing Evil Enters Your Home Tonight | Night Protection Prayer</w:t>
+        <w:t xml:space="preserve"> Blood on the Door: Nothing Evil Enters Your Home Tonight | Night Protection Prayer</w:t>
       </w:r>
     </w:p>
     <w:bookmarkEnd w:id="60"/>
@@ -5898,22 +4656,7 @@
         <w:pStyle w:val="Compact"/>
       </w:pPr>
       <w:r>
-        <w:t xml:space="preserve">Topic / title: [TOPIC, e.g.,</w:t>
-      </w:r>
-      <w:r>
-        <w:t xml:space="preserve"> </w:t>
-      </w:r>
-      <w:r>
-        <w:t xml:space="preserve">“</w:t>
-      </w:r>
-      <w:r>
-        <w:t xml:space="preserve">The Blood of Jesus Over Your Home</w:t>
-      </w:r>
-      <w:r>
-        <w:t xml:space="preserve">”</w:t>
-      </w:r>
-      <w:r>
-        <w:t xml:space="preserve">]</w:t>
+        <w:t xml:space="preserve">Topic / title: [TOPIC, e.g., “The Blood of Jesus Over Your Home”]</w:t>
       </w:r>
     </w:p>
     <w:p>
@@ -5925,7 +4668,7 @@
         <w:pStyle w:val="Compact"/>
       </w:pPr>
       <w:r>
-        <w:t xml:space="preserve">Channel name: [CHANNEL NAME]</w:t>
+        <w:t xml:space="preserve">Channel name: Shielded Tonight Prayers</w:t>
       </w:r>
     </w:p>
     <w:p>
@@ -5973,22 +4716,7 @@
         <w:pStyle w:val="Compact"/>
       </w:pPr>
       <w:r>
-        <w:t xml:space="preserve">Bible story for the opening testimony: [e.g., Rahab’s scarlet cord, Passover, Elisha and the chariots of fire, Daniel in the lions’ den, or</w:t>
-      </w:r>
-      <w:r>
-        <w:t xml:space="preserve"> </w:t>
-      </w:r>
-      <w:r>
-        <w:t xml:space="preserve">“</w:t>
-      </w:r>
-      <w:r>
-        <w:t xml:space="preserve">you choose</w:t>
-      </w:r>
-      <w:r>
-        <w:t xml:space="preserve">”</w:t>
-      </w:r>
-      <w:r>
-        <w:t xml:space="preserve">]</w:t>
+        <w:t xml:space="preserve">Bible story for the opening testimony: [e.g., Rahab’s scarlet cord, Passover, Elisha and the chariots of fire, Daniel in the lions’ den, or “you choose”]</w:t>
       </w:r>
     </w:p>
     <w:bookmarkEnd w:id="62"/>
@@ -6028,61 +4756,7 @@
         <w:pStyle w:val="Compact"/>
       </w:pPr>
       <w:r>
-        <w:t xml:space="preserve">[HOOK] (about 250 words): Start with</w:t>
-      </w:r>
-      <w:r>
-        <w:t xml:space="preserve"> </w:t>
-      </w:r>
-      <w:r>
-        <w:t xml:space="preserve">“</w:t>
-      </w:r>
-      <w:r>
-        <w:t xml:space="preserve">Tonight</w:t>
-      </w:r>
-      <w:r>
-        <w:t xml:space="preserve">”</w:t>
-      </w:r>
-      <w:r>
-        <w:t xml:space="preserve"> </w:t>
-      </w:r>
-      <w:r>
-        <w:t xml:space="preserve">or a direct address. Use a run of negations that flips into affirmations, for example</w:t>
-      </w:r>
-      <w:r>
-        <w:t xml:space="preserve"> </w:t>
-      </w:r>
-      <w:r>
-        <w:t xml:space="preserve">“</w:t>
-      </w:r>
-      <w:r>
-        <w:t xml:space="preserve">You are not lying down unguarded… Tonight you are covered.</w:t>
-      </w:r>
-      <w:r>
-        <w:t xml:space="preserve">”</w:t>
-      </w:r>
-      <w:r>
-        <w:t xml:space="preserve"> </w:t>
-      </w:r>
-      <w:r>
-        <w:t xml:space="preserve">Name the Blood of Jesus within the first 3 sentences. List the stakes (life, home, sleep, family, destiny). Close with</w:t>
-      </w:r>
-      <w:r>
-        <w:t xml:space="preserve"> </w:t>
-      </w:r>
-      <w:r>
-        <w:t xml:space="preserve">“</w:t>
-      </w:r>
-      <w:r>
-        <w:t xml:space="preserve">the same God who…</w:t>
-      </w:r>
-      <w:r>
-        <w:t xml:space="preserve">”</w:t>
-      </w:r>
-      <w:r>
-        <w:t xml:space="preserve"> </w:t>
-      </w:r>
-      <w:r>
-        <w:t xml:space="preserve">sentences that call back to Bible victories, and end with a short line of menace toward the enemy.</w:t>
+        <w:t xml:space="preserve">[HOOK] (about 250 words): Start with “Tonight” or a direct address. Use a run of negations that flips into affirmations, for example “You are not lying down unguarded… Tonight you are covered.” Name the Blood of Jesus within the first 3 sentences. List the stakes (life, home, sleep, family, destiny). Close with “the same God who…” sentences that call back to Bible victories, and end with a short line of menace toward the enemy.</w:t>
       </w:r>
     </w:p>
     <w:p>
@@ -6094,19 +4768,7 @@
         <w:pStyle w:val="Compact"/>
       </w:pPr>
       <w:r>
-        <w:t xml:space="preserve">[THE NIGHTLY WATCH] (about 450 words): Ask the viewer to play this every night for 7, then 14, then 30 nights, and explain why consistency matters. Describe the possible change with modest wording (</w:t>
-      </w:r>
-      <w:r>
-        <w:t xml:space="preserve">“</w:t>
-      </w:r>
-      <w:r>
-        <w:t xml:space="preserve">many who pray this way begin to notice…</w:t>
-      </w:r>
-      <w:r>
-        <w:t xml:space="preserve">”</w:t>
-      </w:r>
-      <w:r>
-        <w:t xml:space="preserve">). Then tell the chosen Bible story vividly as the testimony, and tie it to tonight.</w:t>
+        <w:t xml:space="preserve">[THE NIGHTLY WATCH] (about 450 words): Ask the viewer to play this every night for 7, then 14, then 30 nights, and explain why consistency matters. Describe the possible change with modest wording (“many who pray this way begin to notice…”). Then tell the chosen Bible story vividly as the testimony, and tie it to tonight.</w:t>
       </w:r>
     </w:p>
     <w:p>
@@ -6118,31 +4780,7 @@
         <w:pStyle w:val="Compact"/>
       </w:pPr>
       <w:r>
-        <w:t xml:space="preserve">[THE WEAPON] (about 450 words): Open with a delayed reveal (</w:t>
-      </w:r>
-      <w:r>
-        <w:t xml:space="preserve">“</w:t>
-      </w:r>
-      <w:r>
-        <w:t xml:space="preserve">There is one weapon the enemy cannot stand against…</w:t>
-      </w:r>
-      <w:r>
-        <w:t xml:space="preserve">”</w:t>
-      </w:r>
-      <w:r>
-        <w:t xml:space="preserve">), then name it. Teach it from 2–3 scriptures. End with the first spoken declaration (</w:t>
-      </w:r>
-      <w:r>
-        <w:t xml:space="preserve">“</w:t>
-      </w:r>
-      <w:r>
-        <w:t xml:space="preserve">Say this with me, out loud, right where you are lying…</w:t>
-      </w:r>
-      <w:r>
-        <w:t xml:space="preserve">”</w:t>
-      </w:r>
-      <w:r>
-        <w:t xml:space="preserve">), written in the first person.</w:t>
+        <w:t xml:space="preserve">[THE WEAPON] (about 450 words): Open with a delayed reveal (“There is one weapon the enemy cannot stand against…”), then name it. Teach it from 2–3 scriptures. End with the first spoken declaration (“Say this with me, out loud, right where you are lying…”), written in the first person.</w:t>
       </w:r>
     </w:p>
     <w:p>
@@ -6154,31 +4792,7 @@
         <w:pStyle w:val="Compact"/>
       </w:pPr>
       <w:r>
-        <w:t xml:space="preserve">[THE COVERING] (about 450 words): Intercession, where the host prays over the listener in the third person (</w:t>
-      </w:r>
-      <w:r>
-        <w:t xml:space="preserve">“</w:t>
-      </w:r>
-      <w:r>
-        <w:t xml:space="preserve">this child of God,</w:t>
-      </w:r>
-      <w:r>
-        <w:t xml:space="preserve">”</w:t>
-      </w:r>
-      <w:r>
-        <w:t xml:space="preserve"> </w:t>
-      </w:r>
-      <w:r>
-        <w:t xml:space="preserve">“</w:t>
-      </w:r>
-      <w:r>
-        <w:t xml:space="preserve">this household</w:t>
-      </w:r>
-      <w:r>
-        <w:t xml:space="preserve">”</w:t>
-      </w:r>
-      <w:r>
-        <w:t xml:space="preserve">). Then switch to a first-person declaration.</w:t>
+        <w:t xml:space="preserve">[THE COVERING] (about 450 words): Intercession, where the host prays over the listener in the third person (“this child of God,” “this household”). Then switch to a first-person declaration.</w:t>
       </w:r>
     </w:p>
     <w:p>
@@ -6190,25 +4804,7 @@
         <w:pStyle w:val="Compact"/>
       </w:pPr>
       <w:r>
-        <w:t xml:space="preserve">[BRIDGE] (about 120 words):</w:t>
-      </w:r>
-      <w:r>
-        <w:t xml:space="preserve"> </w:t>
-      </w:r>
-      <w:r>
-        <w:t xml:space="preserve">“</w:t>
-      </w:r>
-      <w:r>
-        <w:t xml:space="preserve">Now we walk the battlefield…</w:t>
-      </w:r>
-      <w:r>
-        <w:t xml:space="preserve">”</w:t>
-      </w:r>
-      <w:r>
-        <w:t xml:space="preserve"> </w:t>
-      </w:r>
-      <w:r>
-        <w:t xml:space="preserve">Tell the listener to speak every following line as their own.</w:t>
+        <w:t xml:space="preserve">[BRIDGE] (about 120 words): “Now we walk the battlefield…” Tell the listener to speak every following line as their own.</w:t>
       </w:r>
     </w:p>
     <w:p>
@@ -6232,19 +4828,7 @@
         <w:pStyle w:val="Compact"/>
       </w:pPr>
       <w:r>
-        <w:t xml:space="preserve">A thesis strike:</w:t>
-      </w:r>
-      <w:r>
-        <w:t xml:space="preserve"> </w:t>
-      </w:r>
-      <w:r>
-        <w:t xml:space="preserve">“</w:t>
-      </w:r>
-      <w:r>
-        <w:t xml:space="preserve">I [strong verb] every [target]… and I [verb] every [related target].</w:t>
-      </w:r>
-      <w:r>
-        <w:t xml:space="preserve">”</w:t>
+        <w:t xml:space="preserve">A thesis strike: “I [strong verb] every [target]… and I [verb] every [related target].”</w:t>
       </w:r>
     </w:p>
     <w:p>
@@ -6280,19 +4864,7 @@
         <w:pStyle w:val="Compact"/>
       </w:pPr>
       <w:r>
-        <w:t xml:space="preserve">A scripture anchor:</w:t>
-      </w:r>
-      <w:r>
-        <w:t xml:space="preserve"> </w:t>
-      </w:r>
-      <w:r>
-        <w:t xml:space="preserve">“</w:t>
-      </w:r>
-      <w:r>
-        <w:t xml:space="preserve">It is written in [Book chapter and verse]. [exact KJV wording].</w:t>
-      </w:r>
-      <w:r>
-        <w:t xml:space="preserve">”</w:t>
+        <w:t xml:space="preserve">A scripture anchor: “It is written in [Book chapter and verse]. [exact KJV wording].”</w:t>
       </w:r>
     </w:p>
     <w:p>
@@ -6304,49 +4876,7 @@
         <w:pStyle w:val="Compact"/>
       </w:pPr>
       <w:r>
-        <w:t xml:space="preserve">A weaponization line, varied each time (</w:t>
-      </w:r>
-      <w:r>
-        <w:t xml:space="preserve">“</w:t>
-      </w:r>
-      <w:r>
-        <w:t xml:space="preserve">I take this word as a sword and…</w:t>
-      </w:r>
-      <w:r>
-        <w:t xml:space="preserve">”</w:t>
-      </w:r>
-      <w:r>
-        <w:t xml:space="preserve">,</w:t>
-      </w:r>
-      <w:r>
-        <w:t xml:space="preserve"> </w:t>
-      </w:r>
-      <w:r>
-        <w:t xml:space="preserve">“</w:t>
-      </w:r>
-      <w:r>
-        <w:t xml:space="preserve">I lift this word like a banner…</w:t>
-      </w:r>
-      <w:r>
-        <w:t xml:space="preserve">”</w:t>
-      </w:r>
-      <w:r>
-        <w:t xml:space="preserve">,</w:t>
-      </w:r>
-      <w:r>
-        <w:t xml:space="preserve"> </w:t>
-      </w:r>
-      <w:r>
-        <w:t xml:space="preserve">“</w:t>
-      </w:r>
-      <w:r>
-        <w:t xml:space="preserve">I drive this word into the ground like a pillar…</w:t>
-      </w:r>
-      <w:r>
-        <w:t xml:space="preserve">”</w:t>
-      </w:r>
-      <w:r>
-        <w:t xml:space="preserve">).</w:t>
+        <w:t xml:space="preserve">A weaponization line, varied each time (“I take this word as a sword and…”, “I lift this word like a banner…”, “I drive this word into the ground like a pillar…”).</w:t>
       </w:r>
     </w:p>
     <w:p>
@@ -6382,55 +4912,7 @@
         <w:pStyle w:val="Compact"/>
       </w:pPr>
       <w:r>
-        <w:t xml:space="preserve">[MID-PRAYER CALL] (about 80 words), placed after about 45% of the script:</w:t>
-      </w:r>
-      <w:r>
-        <w:t xml:space="preserve"> </w:t>
-      </w:r>
-      <w:r>
-        <w:t xml:space="preserve">“</w:t>
-      </w:r>
-      <w:r>
-        <w:t xml:space="preserve">Type</w:t>
-      </w:r>
-      <w:r>
-        <w:t xml:space="preserve"> </w:t>
-      </w:r>
-      <w:r>
-        <w:t xml:space="preserve">‘</w:t>
-      </w:r>
-      <w:r>
-        <w:t xml:space="preserve">[short declaration]</w:t>
-      </w:r>
-      <w:r>
-        <w:t xml:space="preserve">’</w:t>
-      </w:r>
-      <w:r>
-        <w:t xml:space="preserve"> </w:t>
-      </w:r>
-      <w:r>
-        <w:t xml:space="preserve">in the comments</w:t>
-      </w:r>
-      <w:r>
-        <w:t xml:space="preserve">”</w:t>
-      </w:r>
-      <w:r>
-        <w:t xml:space="preserve"> </w:t>
-      </w:r>
-      <w:r>
-        <w:t xml:space="preserve">plus</w:t>
-      </w:r>
-      <w:r>
-        <w:t xml:space="preserve"> </w:t>
-      </w:r>
-      <w:r>
-        <w:t xml:space="preserve">“</w:t>
-      </w:r>
-      <w:r>
-        <w:t xml:space="preserve">share this with one person who needs it tonight.</w:t>
-      </w:r>
-      <w:r>
-        <w:t xml:space="preserve">”</w:t>
+        <w:t xml:space="preserve">[MID-PRAYER CALL] (about 80 words), placed after about 45% of the script: “Type ‘[short declaration]’ in the comments” plus “share this with one person who needs it tonight.”</w:t>
       </w:r>
     </w:p>
     <w:p>
@@ -6442,19 +4924,7 @@
         <w:pStyle w:val="Compact"/>
       </w:pPr>
       <w:r>
-        <w:t xml:space="preserve">[THE FINAL WORD] (about 550 words): A roll-call of verdicts that recaps every wave in fragments with the verb dropped (</w:t>
-      </w:r>
-      <w:r>
-        <w:t xml:space="preserve">“</w:t>
-      </w:r>
-      <w:r>
-        <w:t xml:space="preserve">Every door, sealed. Every altar, burned. Every arrow, reversed.</w:t>
-      </w:r>
-      <w:r>
-        <w:t xml:space="preserve">”</w:t>
-      </w:r>
-      <w:r>
-        <w:t xml:space="preserve">). Then a rapid run of 6–8 scriptures, each followed by a one-line application. Then a closing verdict and a second comment call-to-action.</w:t>
+        <w:t xml:space="preserve">[THE FINAL WORD] (about 550 words): A roll-call of verdicts that recaps every wave in fragments with the verb dropped (“Every door, sealed. Every altar, burned. Every arrow, reversed.”). Then a rapid run of 6–8 scriptures, each followed by a one-line application. Then a closing verdict and a second comment call-to-action.</w:t>
       </w:r>
     </w:p>
     <w:p>
@@ -6478,19 +4948,7 @@
         <w:pStyle w:val="Compact"/>
       </w:pPr>
       <w:r>
-        <w:t xml:space="preserve">[THE SEAL] (about 200 words): A soft first-person declaration, then a short sealing prayer, ending</w:t>
-      </w:r>
-      <w:r>
-        <w:t xml:space="preserve"> </w:t>
-      </w:r>
-      <w:r>
-        <w:t xml:space="preserve">“</w:t>
-      </w:r>
-      <w:r>
-        <w:t xml:space="preserve">In the mighty name of Jesus Christ… Amen.</w:t>
-      </w:r>
-      <w:r>
-        <w:t xml:space="preserve">”</w:t>
+        <w:t xml:space="preserve">[THE SEAL] (about 200 words): A soft first-person declaration, then a short sealing prayer, ending “In the mighty name of Jesus Christ… Amen.”</w:t>
       </w:r>
     </w:p>
     <w:bookmarkEnd w:id="64"/>
@@ -6512,49 +4970,7 @@
         <w:pStyle w:val="Compact"/>
       </w:pPr>
       <w:r>
-        <w:t xml:space="preserve">The prayer decrees and declares. It never asks or hopes. No</w:t>
-      </w:r>
-      <w:r>
-        <w:t xml:space="preserve"> </w:t>
-      </w:r>
-      <w:r>
-        <w:t xml:space="preserve">“</w:t>
-      </w:r>
-      <w:r>
-        <w:t xml:space="preserve">if it be your will,</w:t>
-      </w:r>
-      <w:r>
-        <w:t xml:space="preserve">”</w:t>
-      </w:r>
-      <w:r>
-        <w:t xml:space="preserve"> </w:t>
-      </w:r>
-      <w:r>
-        <w:t xml:space="preserve">“</w:t>
-      </w:r>
-      <w:r>
-        <w:t xml:space="preserve">maybe</w:t>
-      </w:r>
-      <w:r>
-        <w:t xml:space="preserve">”</w:t>
-      </w:r>
-      <w:r>
-        <w:t xml:space="preserve"> </w:t>
-      </w:r>
-      <w:r>
-        <w:t xml:space="preserve">or</w:t>
-      </w:r>
-      <w:r>
-        <w:t xml:space="preserve"> </w:t>
-      </w:r>
-      <w:r>
-        <w:t xml:space="preserve">“</w:t>
-      </w:r>
-      <w:r>
-        <w:t xml:space="preserve">try to.</w:t>
-      </w:r>
-      <w:r>
-        <w:t xml:space="preserve">”</w:t>
+        <w:t xml:space="preserve">The prayer decrees and declares. It never asks or hopes. No “if it be your will,” “maybe” or “try to.”</w:t>
       </w:r>
     </w:p>
     <w:p>
@@ -6566,25 +4982,7 @@
         <w:pStyle w:val="Compact"/>
       </w:pPr>
       <w:r>
-        <w:t xml:space="preserve">The base sentence is</w:t>
-      </w:r>
-      <w:r>
-        <w:t xml:space="preserve"> </w:t>
-      </w:r>
-      <w:r>
-        <w:t xml:space="preserve">“</w:t>
-      </w:r>
-      <w:r>
-        <w:t xml:space="preserve">I + strong verb + object,</w:t>
-      </w:r>
-      <w:r>
-        <w:t xml:space="preserve">”</w:t>
-      </w:r>
-      <w:r>
-        <w:t xml:space="preserve"> </w:t>
-      </w:r>
-      <w:r>
-        <w:t xml:space="preserve">6–14 words. Use verbs such as seal, bind, burn, break, cancel, revoke, reverse, sever, expose, scatter, uproot, silence, cover, decree.</w:t>
+        <w:t xml:space="preserve">The base sentence is “I + strong verb + object,” 6–14 words. Use verbs such as seal, bind, burn, break, cancel, revoke, reverse, sever, expose, scatter, uproot, silence, cover, decree.</w:t>
       </w:r>
     </w:p>
     <w:p>
@@ -6596,37 +4994,7 @@
         <w:pStyle w:val="Compact"/>
       </w:pPr>
       <w:r>
-        <w:t xml:space="preserve">Use anaphora in runs of 3–5:</w:t>
-      </w:r>
-      <w:r>
-        <w:t xml:space="preserve"> </w:t>
-      </w:r>
-      <w:r>
-        <w:t xml:space="preserve">“</w:t>
-      </w:r>
-      <w:r>
-        <w:t xml:space="preserve">Every… Every… Every…</w:t>
-      </w:r>
-      <w:r>
-        <w:t xml:space="preserve">”</w:t>
-      </w:r>
-      <w:r>
-        <w:t xml:space="preserve"> </w:t>
-      </w:r>
-      <w:r>
-        <w:t xml:space="preserve">and</w:t>
-      </w:r>
-      <w:r>
-        <w:t xml:space="preserve"> </w:t>
-      </w:r>
-      <w:r>
-        <w:t xml:space="preserve">“</w:t>
-      </w:r>
-      <w:r>
-        <w:t xml:space="preserve">I burn… I burn… I burn…</w:t>
-      </w:r>
-      <w:r>
-        <w:t xml:space="preserve">”</w:t>
+        <w:t xml:space="preserve">Use anaphora in runs of 3–5: “Every… Every… Every…” and “I burn… I burn… I burn…”</w:t>
       </w:r>
     </w:p>
     <w:p>
@@ -6650,31 +5018,7 @@
         <w:pStyle w:val="Compact"/>
       </w:pPr>
       <w:r>
-        <w:t xml:space="preserve">Use contrast pairs:</w:t>
-      </w:r>
-      <w:r>
-        <w:t xml:space="preserve"> </w:t>
-      </w:r>
-      <w:r>
-        <w:t xml:space="preserve">“</w:t>
-      </w:r>
-      <w:r>
-        <w:t xml:space="preserve">not X, but Y,</w:t>
-      </w:r>
-      <w:r>
-        <w:t xml:space="preserve">”</w:t>
-      </w:r>
-      <w:r>
-        <w:t xml:space="preserve"> </w:t>
-      </w:r>
-      <w:r>
-        <w:t xml:space="preserve">“</w:t>
-      </w:r>
-      <w:r>
-        <w:t xml:space="preserve">not a battlefield, a resting place.</w:t>
-      </w:r>
-      <w:r>
-        <w:t xml:space="preserve">”</w:t>
+        <w:t xml:space="preserve">Use contrast pairs: “not X, but Y,” “not a battlefield, a resting place.”</w:t>
       </w:r>
     </w:p>
     <w:p>
@@ -6686,19 +5030,7 @@
         <w:pStyle w:val="Compact"/>
       </w:pPr>
       <w:r>
-        <w:t xml:space="preserve">Close lists with triple adjectives:</w:t>
-      </w:r>
-      <w:r>
-        <w:t xml:space="preserve"> </w:t>
-      </w:r>
-      <w:r>
-        <w:t xml:space="preserve">“</w:t>
-      </w:r>
-      <w:r>
-        <w:t xml:space="preserve">living, burning, and unbreakable.</w:t>
-      </w:r>
-      <w:r>
-        <w:t xml:space="preserve">”</w:t>
+        <w:t xml:space="preserve">Close lists with triple adjectives: “living, burning, and unbreakable.”</w:t>
       </w:r>
     </w:p>
     <w:p>
@@ -6710,97 +5042,7 @@
         <w:pStyle w:val="Compact"/>
       </w:pPr>
       <w:r>
-        <w:t xml:space="preserve">Address modes:</w:t>
-      </w:r>
-      <w:r>
-        <w:t xml:space="preserve"> </w:t>
-      </w:r>
-      <w:r>
-        <w:t xml:space="preserve">“</w:t>
-      </w:r>
-      <w:r>
-        <w:t xml:space="preserve">you</w:t>
-      </w:r>
-      <w:r>
-        <w:t xml:space="preserve">”</w:t>
-      </w:r>
-      <w:r>
-        <w:t xml:space="preserve"> </w:t>
-      </w:r>
-      <w:r>
-        <w:t xml:space="preserve">to teach,</w:t>
-      </w:r>
-      <w:r>
-        <w:t xml:space="preserve"> </w:t>
-      </w:r>
-      <w:r>
-        <w:t xml:space="preserve">“</w:t>
-      </w:r>
-      <w:r>
-        <w:t xml:space="preserve">we</w:t>
-      </w:r>
-      <w:r>
-        <w:t xml:space="preserve">”</w:t>
-      </w:r>
-      <w:r>
-        <w:t xml:space="preserve"> </w:t>
-      </w:r>
-      <w:r>
-        <w:t xml:space="preserve">and</w:t>
-      </w:r>
-      <w:r>
-        <w:t xml:space="preserve"> </w:t>
-      </w:r>
-      <w:r>
-        <w:t xml:space="preserve">“</w:t>
-      </w:r>
-      <w:r>
-        <w:t xml:space="preserve">this household</w:t>
-      </w:r>
-      <w:r>
-        <w:t xml:space="preserve">”</w:t>
-      </w:r>
-      <w:r>
-        <w:t xml:space="preserve"> </w:t>
-      </w:r>
-      <w:r>
-        <w:t xml:space="preserve">to intercede,</w:t>
-      </w:r>
-      <w:r>
-        <w:t xml:space="preserve"> </w:t>
-      </w:r>
-      <w:r>
-        <w:t xml:space="preserve">“</w:t>
-      </w:r>
-      <w:r>
-        <w:t xml:space="preserve">I</w:t>
-      </w:r>
-      <w:r>
-        <w:t xml:space="preserve">”</w:t>
-      </w:r>
-      <w:r>
-        <w:t xml:space="preserve"> </w:t>
-      </w:r>
-      <w:r>
-        <w:t xml:space="preserve">and</w:t>
-      </w:r>
-      <w:r>
-        <w:t xml:space="preserve"> </w:t>
-      </w:r>
-      <w:r>
-        <w:t xml:space="preserve">“</w:t>
-      </w:r>
-      <w:r>
-        <w:t xml:space="preserve">my</w:t>
-      </w:r>
-      <w:r>
-        <w:t xml:space="preserve">”</w:t>
-      </w:r>
-      <w:r>
-        <w:t xml:space="preserve"> </w:t>
-      </w:r>
-      <w:r>
-        <w:t xml:space="preserve">to declare. Cycle through all three.</w:t>
+        <w:t xml:space="preserve">Address modes: “you” to teach, “we” and “this household” to intercede, “I” and “my” to declare. Cycle through all three.</w:t>
       </w:r>
     </w:p>
     <w:p>
@@ -6870,19 +5112,7 @@
         <w:pStyle w:val="Compact"/>
       </w:pPr>
       <w:r>
-        <w:t xml:space="preserve">Use real verses only, quoted in KJV wording, with correct references written the way they are spoken (</w:t>
-      </w:r>
-      <w:r>
-        <w:t xml:space="preserve">“</w:t>
-      </w:r>
-      <w:r>
-        <w:t xml:space="preserve">Psalm 91 and verse 10</w:t>
-      </w:r>
-      <w:r>
-        <w:t xml:space="preserve">”</w:t>
-      </w:r>
-      <w:r>
-        <w:t xml:space="preserve">).</w:t>
+        <w:t xml:space="preserve">Use real verses only, quoted in KJV wording, with correct references written the way they are spoken (“Psalm 91 and verse 10”).</w:t>
       </w:r>
     </w:p>
     <w:p>
@@ -6940,19 +5170,7 @@
         <w:pStyle w:val="Compact"/>
       </w:pPr>
       <w:r>
-        <w:t xml:space="preserve">Do not invent viewer testimonies or present made-up stories as real. Use Bible stories, or clearly hypothetical framing (</w:t>
-      </w:r>
-      <w:r>
-        <w:t xml:space="preserve">“</w:t>
-      </w:r>
-      <w:r>
-        <w:t xml:space="preserve">Picture a mother who…</w:t>
-      </w:r>
-      <w:r>
-        <w:t xml:space="preserve">”</w:t>
-      </w:r>
-      <w:r>
-        <w:t xml:space="preserve">).</w:t>
+        <w:t xml:space="preserve">Do not invent viewer testimonies or present made-up stories as real. Use Bible stories, or clearly hypothetical framing (“Picture a mother who…”).</w:t>
       </w:r>
     </w:p>
     <w:p>
@@ -6976,25 +5194,7 @@
         <w:pStyle w:val="Compact"/>
       </w:pPr>
       <w:r>
-        <w:t xml:space="preserve">Do not name or target any real person, group, religion or ethnicity as</w:t>
-      </w:r>
-      <w:r>
-        <w:t xml:space="preserve"> </w:t>
-      </w:r>
-      <w:r>
-        <w:t xml:space="preserve">“</w:t>
-      </w:r>
-      <w:r>
-        <w:t xml:space="preserve">the enemy.</w:t>
-      </w:r>
-      <w:r>
-        <w:t xml:space="preserve">”</w:t>
-      </w:r>
-      <w:r>
-        <w:t xml:space="preserve"> </w:t>
-      </w:r>
-      <w:r>
-        <w:t xml:space="preserve">The enemy is spiritual: spirits, curses, altars, arrows, darkness.</w:t>
+        <w:t xml:space="preserve">Do not name or target any real person, group, religion or ethnicity as “the enemy.” The enemy is spiritual: spirits, curses, altars, arrows, darkness.</w:t>
       </w:r>
     </w:p>
     <w:p>
@@ -7064,22 +5264,7 @@
         <w:pStyle w:val="Compact"/>
       </w:pPr>
       <w:r>
-        <w:t xml:space="preserve">If the script is too long for one reply, write it in parts: Part 1 is HOOK through BRIDGE, Part 2 is the WAVES, and Part 3 is FINAL WORD through SEAL. Stop after each part and continue when I say</w:t>
-      </w:r>
-      <w:r>
-        <w:t xml:space="preserve"> </w:t>
-      </w:r>
-      <w:r>
-        <w:t xml:space="preserve">“</w:t>
-      </w:r>
-      <w:r>
-        <w:t xml:space="preserve">continue</w:t>
-      </w:r>
-      <w:r>
-        <w:t xml:space="preserve">”</w:t>
-      </w:r>
-      <w:r>
-        <w:t xml:space="preserve">. Keep the voice identical across parts and give the word count at the end.</w:t>
+        <w:t xml:space="preserve">If the script is too long for one reply, write it in parts: Part 1 is HOOK through BRIDGE, Part 2 is the WAVES, and Part 3 is FINAL WORD through SEAL. Stop after each part and continue when I say “continue”. Keep the voice identical across parts and give the word count at the end.</w:t>
       </w:r>
     </w:p>
     <w:p>
@@ -7142,7 +5327,7 @@
         <w:pStyle w:val="Compact"/>
       </w:pPr>
       <w:r>
-        <w:t xml:space="preserve">Channel name: [CHANNEL NAME]</w:t>
+        <w:t xml:space="preserve">Channel name: Shielded Tonight Prayers</w:t>
       </w:r>
     </w:p>
     <w:p>
@@ -7154,37 +5339,7 @@
         <w:pStyle w:val="Compact"/>
       </w:pPr>
       <w:r>
-        <w:t xml:space="preserve">Topic: [TOPIC, e.g.,</w:t>
-      </w:r>
-      <w:r>
-        <w:t xml:space="preserve"> </w:t>
-      </w:r>
-      <w:r>
-        <w:t xml:space="preserve">“</w:t>
-      </w:r>
-      <w:r>
-        <w:t xml:space="preserve">The Blood of Jesus Over Your Home</w:t>
-      </w:r>
-      <w:r>
-        <w:t xml:space="preserve">”</w:t>
-      </w:r>
-      <w:r>
-        <w:t xml:space="preserve">, or write</w:t>
-      </w:r>
-      <w:r>
-        <w:t xml:space="preserve"> </w:t>
-      </w:r>
-      <w:r>
-        <w:t xml:space="preserve">“</w:t>
-      </w:r>
-      <w:r>
-        <w:t xml:space="preserve">suggest 5 topics first</w:t>
-      </w:r>
-      <w:r>
-        <w:t xml:space="preserve">”</w:t>
-      </w:r>
-      <w:r>
-        <w:t xml:space="preserve">]</w:t>
+        <w:t xml:space="preserve">Topic: [TOPIC, e.g., “The Blood of Jesus Over Your Home”, or write “suggest 5 topics first”]</w:t>
       </w:r>
     </w:p>
     <w:p>
@@ -7220,22 +5375,7 @@
         <w:pStyle w:val="Compact"/>
       </w:pPr>
       <w:r>
-        <w:t xml:space="preserve">Chorus scripture: [e.g., Exodus 12:13 / Isaiah 54:17 / Psalm 91:10, or</w:t>
-      </w:r>
-      <w:r>
-        <w:t xml:space="preserve"> </w:t>
-      </w:r>
-      <w:r>
-        <w:t xml:space="preserve">“</w:t>
-      </w:r>
-      <w:r>
-        <w:t xml:space="preserve">you choose</w:t>
-      </w:r>
-      <w:r>
-        <w:t xml:space="preserve">”</w:t>
-      </w:r>
-      <w:r>
-        <w:t xml:space="preserve">]</w:t>
+        <w:t xml:space="preserve">Chorus scripture: [e.g., Exodus 12:13 / Isaiah 54:17 / Psalm 91:10, or “you choose”]</w:t>
       </w:r>
     </w:p>
     <w:p>
@@ -7247,22 +5387,7 @@
         <w:pStyle w:val="Compact"/>
       </w:pPr>
       <w:r>
-        <w:t xml:space="preserve">Bible story for the testimony: [e.g., Rahab’s scarlet cord / Passover / Elisha’s chariots of fire / Daniel in the lions’ den, or</w:t>
-      </w:r>
-      <w:r>
-        <w:t xml:space="preserve"> </w:t>
-      </w:r>
-      <w:r>
-        <w:t xml:space="preserve">“</w:t>
-      </w:r>
-      <w:r>
-        <w:t xml:space="preserve">you choose</w:t>
-      </w:r>
-      <w:r>
-        <w:t xml:space="preserve">”</w:t>
-      </w:r>
-      <w:r>
-        <w:t xml:space="preserve">]</w:t>
+        <w:t xml:space="preserve">Bible story for the testimony: [e.g., Rahab’s scarlet cord / Passover / Elisha’s chariots of fire / Daniel in the lions’ den, or “you choose”]</w:t>
       </w:r>
     </w:p>
     <w:bookmarkEnd w:id="70"/>
@@ -7290,22 +5415,7 @@
         <w:pStyle w:val="Heading2"/>
       </w:pPr>
       <w:r>
-        <w:t xml:space="preserve">DELIVERY ORDER (stop after each part and wait for me to say</w:t>
-      </w:r>
-      <w:r>
-        <w:t xml:space="preserve"> </w:t>
-      </w:r>
-      <w:r>
-        <w:t xml:space="preserve">“</w:t>
-      </w:r>
-      <w:r>
-        <w:t xml:space="preserve">continue</w:t>
-      </w:r>
-      <w:r>
-        <w:t xml:space="preserve">”</w:t>
-      </w:r>
-      <w:r>
-        <w:t xml:space="preserve">)</w:t>
+        <w:t xml:space="preserve">DELIVERY ORDER (stop after each part and wait for me to say “continue”)</w:t>
       </w:r>
     </w:p>
     <w:p>
@@ -7403,19 +5513,7 @@
         <w:pStyle w:val="Compact"/>
       </w:pPr>
       <w:r>
-        <w:t xml:space="preserve">Proven angles to rotate: return to sender or reversed, sealed or covered, no evil enters, destroy every hidden attack, a Psalm number + warfare prayer,</w:t>
-      </w:r>
-      <w:r>
-        <w:t xml:space="preserve"> </w:t>
-      </w:r>
-      <w:r>
-        <w:t xml:space="preserve">“</w:t>
-      </w:r>
-      <w:r>
-        <w:t xml:space="preserve">Play this before you sleep.</w:t>
-      </w:r>
-      <w:r>
-        <w:t xml:space="preserve">”</w:t>
+        <w:t xml:space="preserve">Proven angles to rotate: return to sender or reversed, sealed or covered, no evil enters, destroy every hidden attack, a Psalm number + warfare prayer, “Play this before you sleep.”</w:t>
       </w:r>
     </w:p>
     <w:p>
@@ -7427,25 +5525,7 @@
         <w:pStyle w:val="Compact"/>
       </w:pPr>
       <w:r>
-        <w:t xml:space="preserve">Use</w:t>
-      </w:r>
-      <w:r>
-        <w:t xml:space="preserve"> </w:t>
-      </w:r>
-      <w:r>
-        <w:t xml:space="preserve">“</w:t>
-      </w:r>
-      <w:r>
-        <w:t xml:space="preserve">Tonight</w:t>
-      </w:r>
-      <w:r>
-        <w:t xml:space="preserve">”</w:t>
-      </w:r>
-      <w:r>
-        <w:t xml:space="preserve"> </w:t>
-      </w:r>
-      <w:r>
-        <w:t xml:space="preserve">or a night cue in at least 3 of the 5. Keep each under 100 characters, with the strongest words first. Star your top pick.</w:t>
+        <w:t xml:space="preserve">Use “Tonight” or a night cue in at least 3 of the 5. Keep each under 100 characters, with the strongest words first. Star your top pick.</w:t>
       </w:r>
     </w:p>
     <w:bookmarkEnd w:id="73"/>
@@ -7463,16 +5543,7 @@
         <w:pStyle w:val="FirstParagraph"/>
       </w:pPr>
       <w:r>
-        <w:t xml:space="preserve">Write one master prompt and two alternates. Each must be fully standalone and include:</w:t>
-      </w:r>
-      <w:r>
-        <w:t xml:space="preserve"> </w:t>
-      </w:r>
-      <w:r>
-        <w:t xml:space="preserve">-</w:t>
-      </w:r>
-      <w:r>
-        <w:t xml:space="preserve"> </w:t>
+        <w:t xml:space="preserve">Write one master prompt and two alternates. Each must be fully standalone and include: - </w:t>
       </w:r>
       <w:r>
         <w:rPr>
@@ -7482,19 +5553,7 @@
         <w:t xml:space="preserve">Subject:</w:t>
       </w:r>
       <w:r>
-        <w:t xml:space="preserve"> </w:t>
-      </w:r>
-      <w:r>
-        <w:t xml:space="preserve">ONE sacred focal object tied to the topic (for example a blood-marked door, a burning cross, a sword over an open Bible, a sealed letter with a cross wax seal, a scarlet cord in a window, a candle and Bible, a cross on a hill). Use no faces in the master image.</w:t>
-      </w:r>
-      <w:r>
-        <w:t xml:space="preserve"> </w:t>
-      </w:r>
-      <w:r>
-        <w:t xml:space="preserve">-</w:t>
-      </w:r>
-      <w:r>
-        <w:t xml:space="preserve"> </w:t>
+        <w:t xml:space="preserve"> ONE sacred focal object tied to the topic (for example a blood-marked door, a burning cross, a sword over an open Bible, a sealed letter with a cross wax seal, a scarlet cord in a window, a candle and Bible, a cross on a hill). Use no faces in the master image. - </w:t>
       </w:r>
       <w:r>
         <w:rPr>
@@ -7504,25 +5563,7 @@
         <w:t xml:space="preserve">Locked style:</w:t>
       </w:r>
       <w:r>
-        <w:t xml:space="preserve"> </w:t>
-      </w:r>
-      <w:r>
-        <w:t xml:space="preserve">“</w:t>
-      </w:r>
-      <w:r>
-        <w:t xml:space="preserve">Cinematic devotional digital painting, painterly realism, sacred Christian concept art. Palette: deep crimson, burnt orange, ember red, smoky maroon, with molten gold and warm amber highlights and near-black brown shadows; no cool tones. Single dominant warm light source, volumetric god rays through drifting smoke, rim lighting, strong chiaroscuro, heavy dark vignette. Floating glowing embers and ash. Highly detailed subject, soft misty painterly background. Centered symmetrical composition, lower fifth of the frame dark and uncluttered for captions. Eye-level or slightly low camera. Reverent, protective, powerful mood. 16:9, 4K, no text, no logos, no watermark.</w:t>
-      </w:r>
-      <w:r>
-        <w:t xml:space="preserve">”</w:t>
-      </w:r>
-      <w:r>
-        <w:t xml:space="preserve"> </w:t>
-      </w:r>
-      <w:r>
-        <w:t xml:space="preserve">-</w:t>
-      </w:r>
-      <w:r>
-        <w:t xml:space="preserve"> </w:t>
+        <w:t xml:space="preserve"> “Cinematic devotional digital painting, painterly realism, sacred Christian concept art. Palette: deep crimson, burnt orange, ember red, smoky maroon, with molten gold and warm amber highlights and near-black brown shadows; no cool tones. Single dominant warm light source, volumetric god rays through drifting smoke, rim lighting, strong chiaroscuro, heavy dark vignette. Floating glowing embers and ash. Highly detailed subject, soft misty painterly background. Centered symmetrical composition, lower fifth of the frame dark and uncluttered for captions. Eye-level or slightly low camera. Reverent, protective, powerful mood. 16:9, 4K, no text, no logos, no watermark.” - </w:t>
       </w:r>
       <w:r>
         <w:rPr>
@@ -7532,10 +5573,7 @@
         <w:t xml:space="preserve">Fields:</w:t>
       </w:r>
       <w:r>
-        <w:t xml:space="preserve"> </w:t>
-      </w:r>
-      <w:r>
-        <w:t xml:space="preserve">Camera Angle, Lighting, Mood, Action.</w:t>
+        <w:t xml:space="preserve"> Camera Angle, Lighting, Mood, Action.</w:t>
       </w:r>
     </w:p>
     <w:bookmarkEnd w:id="74"/>
@@ -7553,31 +5591,7 @@
         <w:pStyle w:val="FirstParagraph"/>
       </w:pPr>
       <w:r>
-        <w:t xml:space="preserve">For the master image, write one 8–10 second, seamless, almost-still motion prompt:</w:t>
-      </w:r>
-      <w:r>
-        <w:t xml:space="preserve"> </w:t>
-      </w:r>
-      <w:r>
-        <w:t xml:space="preserve">- Only gentle elements move: candle flicker, a slow pulse of glow, drifting smoke, rising embers, a slight sway of fabric or cord, shimmering light.</w:t>
-      </w:r>
-      <w:r>
-        <w:t xml:space="preserve"> </w:t>
-      </w:r>
-      <w:r>
-        <w:t xml:space="preserve">- The camera holds still with a very slow push-in of about 2 percent.</w:t>
-      </w:r>
-      <w:r>
-        <w:t xml:space="preserve"> </w:t>
-      </w:r>
-      <w:r>
-        <w:t xml:space="preserve">- Add a negative prompt (fast motion, camera shake, people, faces, morphing, flicker artifacts, blue tones, text, logos).</w:t>
-      </w:r>
-      <w:r>
-        <w:t xml:space="preserve"> </w:t>
-      </w:r>
-      <w:r>
-        <w:t xml:space="preserve">- Add settings: 16:9, motion strength 2–3 out of 10, the same image as the start and end frame.</w:t>
+        <w:t xml:space="preserve">For the master image, write one 8–10 second, seamless, almost-still motion prompt: - Only gentle elements move: candle flicker, a slow pulse of glow, drifting smoke, rising embers, a slight sway of fabric or cord, shimmering light. - The camera holds still with a very slow push-in of about 2 percent. - Add a negative prompt (fast motion, camera shake, people, faces, morphing, flicker artifacts, blue tones, text, logos). - Add settings: 16:9, motion strength 2–3 out of 10, the same image as the start and end frame.</w:t>
       </w:r>
     </w:p>
     <w:bookmarkEnd w:id="75"/>
@@ -7595,16 +5609,7 @@
         <w:pStyle w:val="FirstParagraph"/>
       </w:pPr>
       <w:r>
-        <w:t xml:space="preserve">Template, matching the niche leaders:</w:t>
-      </w:r>
-      <w:r>
-        <w:t xml:space="preserve"> </w:t>
-      </w:r>
-      <w:r>
-        <w:t xml:space="preserve">-</w:t>
-      </w:r>
-      <w:r>
-        <w:t xml:space="preserve"> </w:t>
+        <w:t xml:space="preserve">Template, matching the niche leaders: - </w:t>
       </w:r>
       <w:r>
         <w:rPr>
@@ -7614,19 +5619,7 @@
         <w:t xml:space="preserve">Layout:</w:t>
       </w:r>
       <w:r>
-        <w:t xml:space="preserve"> </w:t>
-      </w:r>
-      <w:r>
-        <w:t xml:space="preserve">text column on the left 55–60% over a darkened background; one glowing hero object on the right 40–45%; the bottom-right corner kept clear for the timestamp; no faces.</w:t>
-      </w:r>
-      <w:r>
-        <w:t xml:space="preserve"> </w:t>
-      </w:r>
-      <w:r>
-        <w:t xml:space="preserve">-</w:t>
-      </w:r>
-      <w:r>
-        <w:t xml:space="preserve"> </w:t>
+        <w:t xml:space="preserve"> text column on the left 55–60% over a darkened background; one glowing hero object on the right 40–45%; the bottom-right corner kept clear for the timestamp; no faces. - </w:t>
       </w:r>
       <w:r>
         <w:rPr>
@@ -7636,19 +5629,7 @@
         <w:t xml:space="preserve">Headline:</w:t>
       </w:r>
       <w:r>
-        <w:t xml:space="preserve"> </w:t>
-      </w:r>
-      <w:r>
-        <w:t xml:space="preserve">2–3 lines of ultra-bold condensed caps (Anton or Oswald). The first line is silver-white metallic and the payoff line is a fire-gold gradient, with a dark stroke and glow.</w:t>
-      </w:r>
-      <w:r>
-        <w:t xml:space="preserve"> </w:t>
-      </w:r>
-      <w:r>
-        <w:t xml:space="preserve">-</w:t>
-      </w:r>
-      <w:r>
-        <w:t xml:space="preserve"> </w:t>
+        <w:t xml:space="preserve"> 2–3 lines of ultra-bold condensed caps (Anton or Oswald). The first line is silver-white metallic and the payoff line is a fire-gold gradient, with a dark stroke and glow. - </w:t>
       </w:r>
       <w:r>
         <w:rPr>
@@ -7658,19 +5639,7 @@
         <w:t xml:space="preserve">Below the headline:</w:t>
       </w:r>
       <w:r>
-        <w:t xml:space="preserve"> </w:t>
-      </w:r>
-      <w:r>
-        <w:t xml:space="preserve">a gold flourish divider, then a 3-line subline of keywords in gold caps (witchcraft, curses, evil attacks, night protection, etc.), then an optional ribbon with the channel name between gold scroll ornaments.</w:t>
-      </w:r>
-      <w:r>
-        <w:t xml:space="preserve"> </w:t>
-      </w:r>
-      <w:r>
-        <w:t xml:space="preserve">-</w:t>
-      </w:r>
-      <w:r>
-        <w:t xml:space="preserve"> </w:t>
+        <w:t xml:space="preserve"> a gold flourish divider, then a 3-line subline of keywords in gold caps (witchcraft, curses, evil attacks, night protection, etc.), then an optional ribbon with the channel name between gold scroll ornaments. - </w:t>
       </w:r>
       <w:r>
         <w:rPr>
@@ -7680,34 +5649,7 @@
         <w:t xml:space="preserve">For each thumbnail give:</w:t>
       </w:r>
       <w:r>
-        <w:t xml:space="preserve"> </w:t>
-      </w:r>
-      <w:r>
-        <w:t xml:space="preserve">Visual Concept, Text Overlay (headline + subline), Emotion Trigger, a Background Prompt (the left side dark and empty,</w:t>
-      </w:r>
-      <w:r>
-        <w:t xml:space="preserve"> </w:t>
-      </w:r>
-      <w:r>
-        <w:t xml:space="preserve">“</w:t>
-      </w:r>
-      <w:r>
-        <w:t xml:space="preserve">no text</w:t>
-      </w:r>
-      <w:r>
-        <w:t xml:space="preserve">”</w:t>
-      </w:r>
-      <w:r>
-        <w:t xml:space="preserve">), and an All-in-one Prompt with the text written in, for text-capable generators.</w:t>
-      </w:r>
-      <w:r>
-        <w:t xml:space="preserve"> </w:t>
-      </w:r>
-      <w:r>
-        <w:t xml:space="preserve">-</w:t>
-      </w:r>
-      <w:r>
-        <w:t xml:space="preserve"> </w:t>
+        <w:t xml:space="preserve"> Visual Concept, Text Overlay (headline + subline), Emotion Trigger, a Background Prompt (the left side dark and empty, “no text”), and an All-in-one Prompt with the text written in, for text-capable generators. - </w:t>
       </w:r>
       <w:r>
         <w:rPr>
@@ -7717,16 +5659,7 @@
         <w:t xml:space="preserve">Spread the emotion triggers across the five:</w:t>
       </w:r>
       <w:r>
-        <w:t xml:space="preserve"> </w:t>
-      </w:r>
-      <w:r>
-        <w:t xml:space="preserve">retaliation (sent back or doubled), protection (sealed, nothing enters), urgency (tonight), named fear overcome (the destroyer, night terrors), awe and comfort (angels, chariots of fire).</w:t>
-      </w:r>
-      <w:r>
-        <w:t xml:space="preserve"> </w:t>
-      </w:r>
-      <w:r>
-        <w:t xml:space="preserve">- Recommend one to lead and one to A/B test.</w:t>
+        <w:t xml:space="preserve"> retaliation (sent back or doubled), protection (sealed, nothing enters), urgency (tonight), named fear overcome (the destroyer, night terrors), awe and comfort (angels, chariots of fire). - Recommend one to lead and one to A/B test.</w:t>
       </w:r>
     </w:p>
     <w:bookmarkEnd w:id="76"/>
@@ -7755,28 +5688,7 @@
         <w:t xml:space="preserve">Description:</w:t>
       </w:r>
       <w:r>
-        <w:t xml:space="preserve"> </w:t>
-      </w:r>
-      <w:r>
-        <w:t xml:space="preserve">about 150 words in the channel’s warm pastoral voice. Open with a 2-line hook, then what the prayer covers as 4 emoji bullets (🛡️ 🔥 🩸 📖), then one scripture, then</w:t>
-      </w:r>
-      <w:r>
-        <w:t xml:space="preserve"> </w:t>
-      </w:r>
-      <w:r>
-        <w:t xml:space="preserve">“</w:t>
-      </w:r>
-      <w:r>
-        <w:t xml:space="preserve">play this nightly before you sleep,</w:t>
-      </w:r>
-      <w:r>
-        <w:t xml:space="preserve">”</w:t>
-      </w:r>
-      <w:r>
-        <w:t xml:space="preserve"> </w:t>
-      </w:r>
-      <w:r>
-        <w:t xml:space="preserve">then a subscribe line. No products, no links to sell anything.</w:t>
+        <w:t xml:space="preserve"> about 150 words in the channel’s warm pastoral voice. Open with a 2-line hook, then what the prayer covers as 4 emoji bullets (🛡️ 🔥 🩸 📖), then one scripture, then “play this nightly before you sleep,” then a subscribe line. No products, no links to sell anything.</w:t>
       </w:r>
     </w:p>
     <w:p>
@@ -7795,10 +5707,7 @@
         <w:t xml:space="preserve">Tags:</w:t>
       </w:r>
       <w:r>
-        <w:t xml:space="preserve"> </w:t>
-      </w:r>
-      <w:r>
-        <w:t xml:space="preserve">15–20 tags plus 3 hashtags.</w:t>
+        <w:t xml:space="preserve"> 15–20 tags plus 3 hashtags.</w:t>
       </w:r>
     </w:p>
     <w:p>
@@ -7817,10 +5726,7 @@
         <w:t xml:space="preserve">Pinned comment:</w:t>
       </w:r>
       <w:r>
-        <w:t xml:space="preserve"> </w:t>
-      </w:r>
-      <w:r>
-        <w:t xml:space="preserve">one line, the declaration viewers are asked to type.</w:t>
+        <w:t xml:space="preserve"> one line, the declaration viewers are asked to type.</w:t>
       </w:r>
     </w:p>
     <w:bookmarkEnd w:id="77"/>
@@ -7949,55 +5855,7 @@
         <w:pStyle w:val="Compact"/>
       </w:pPr>
       <w:r>
-        <w:t xml:space="preserve">[HOOK] (about 250 words): Open with</w:t>
-      </w:r>
-      <w:r>
-        <w:t xml:space="preserve"> </w:t>
-      </w:r>
-      <w:r>
-        <w:t xml:space="preserve">“</w:t>
-      </w:r>
-      <w:r>
-        <w:t xml:space="preserve">Tonight</w:t>
-      </w:r>
-      <w:r>
-        <w:t xml:space="preserve">”</w:t>
-      </w:r>
-      <w:r>
-        <w:t xml:space="preserve"> </w:t>
-      </w:r>
-      <w:r>
-        <w:t xml:space="preserve">or a direct address. Use a run of negations that flips into affirmations (</w:t>
-      </w:r>
-      <w:r>
-        <w:t xml:space="preserve">“</w:t>
-      </w:r>
-      <w:r>
-        <w:t xml:space="preserve">You are not… You are not… Tonight you are covered.</w:t>
-      </w:r>
-      <w:r>
-        <w:t xml:space="preserve">”</w:t>
-      </w:r>
-      <w:r>
-        <w:t xml:space="preserve">). Name the Blood of Jesus within 3 sentences. List the stakes: life, home, sleep, family, destiny. Add</w:t>
-      </w:r>
-      <w:r>
-        <w:t xml:space="preserve"> </w:t>
-      </w:r>
-      <w:r>
-        <w:t xml:space="preserve">“</w:t>
-      </w:r>
-      <w:r>
-        <w:t xml:space="preserve">The same God who…</w:t>
-      </w:r>
-      <w:r>
-        <w:t xml:space="preserve">”</w:t>
-      </w:r>
-      <w:r>
-        <w:t xml:space="preserve"> </w:t>
-      </w:r>
-      <w:r>
-        <w:t xml:space="preserve">callbacks to Bible victories, and end with a line of menace toward the enemy.</w:t>
+        <w:t xml:space="preserve">[HOOK] (about 250 words): Open with “Tonight” or a direct address. Use a run of negations that flips into affirmations (“You are not… You are not… Tonight you are covered.”). Name the Blood of Jesus within 3 sentences. List the stakes: life, home, sleep, family, destiny. Add “The same God who…” callbacks to Bible victories, and end with a line of menace toward the enemy.</w:t>
       </w:r>
     </w:p>
     <w:p>
@@ -8009,19 +5867,7 @@
         <w:pStyle w:val="Compact"/>
       </w:pPr>
       <w:r>
-        <w:t xml:space="preserve">[THE NIGHTLY WATCH] (about 450 words): Ask for a 7, then 14, then 30-night habit and explain why consistency matters. Describe outcomes modestly (</w:t>
-      </w:r>
-      <w:r>
-        <w:t xml:space="preserve">“</w:t>
-      </w:r>
-      <w:r>
-        <w:t xml:space="preserve">many who pray this way begin to notice…</w:t>
-      </w:r>
-      <w:r>
-        <w:t xml:space="preserve">”</w:t>
-      </w:r>
-      <w:r>
-        <w:t xml:space="preserve">). Tell the chosen Bible story vividly as the testimony and tie it to tonight.</w:t>
+        <w:t xml:space="preserve">[THE NIGHTLY WATCH] (about 450 words): Ask for a 7, then 14, then 30-night habit and explain why consistency matters. Describe outcomes modestly (“many who pray this way begin to notice…”). Tell the chosen Bible story vividly as the testimony and tie it to tonight.</w:t>
       </w:r>
     </w:p>
     <w:p>
@@ -8033,31 +5879,7 @@
         <w:pStyle w:val="Compact"/>
       </w:pPr>
       <w:r>
-        <w:t xml:space="preserve">[THE WEAPON] (about 450 words): A delayed reveal (</w:t>
-      </w:r>
-      <w:r>
-        <w:t xml:space="preserve">“</w:t>
-      </w:r>
-      <w:r>
-        <w:t xml:space="preserve">There is one weapon the enemy cannot stand against…</w:t>
-      </w:r>
-      <w:r>
-        <w:t xml:space="preserve">”</w:t>
-      </w:r>
-      <w:r>
-        <w:t xml:space="preserve">), teaching from 2–3 scriptures, then the first spoken first-person declaration (</w:t>
-      </w:r>
-      <w:r>
-        <w:t xml:space="preserve">“</w:t>
-      </w:r>
-      <w:r>
-        <w:t xml:space="preserve">Say this with me, out loud, right where you are lying…</w:t>
-      </w:r>
-      <w:r>
-        <w:t xml:space="preserve">”</w:t>
-      </w:r>
-      <w:r>
-        <w:t xml:space="preserve">).</w:t>
+        <w:t xml:space="preserve">[THE WEAPON] (about 450 words): A delayed reveal (“There is one weapon the enemy cannot stand against…”), teaching from 2–3 scriptures, then the first spoken first-person declaration (“Say this with me, out loud, right where you are lying…”).</w:t>
       </w:r>
     </w:p>
     <w:p>
@@ -8069,43 +5891,7 @@
         <w:pStyle w:val="Compact"/>
       </w:pPr>
       <w:r>
-        <w:t xml:space="preserve">[THE COVERING] (about 450 words): Intercession over</w:t>
-      </w:r>
-      <w:r>
-        <w:t xml:space="preserve"> </w:t>
-      </w:r>
-      <w:r>
-        <w:t xml:space="preserve">“</w:t>
-      </w:r>
-      <w:r>
-        <w:t xml:space="preserve">this child of God</w:t>
-      </w:r>
-      <w:r>
-        <w:t xml:space="preserve">”</w:t>
-      </w:r>
-      <w:r>
-        <w:t xml:space="preserve"> </w:t>
-      </w:r>
-      <w:r>
-        <w:t xml:space="preserve">and</w:t>
-      </w:r>
-      <w:r>
-        <w:t xml:space="preserve"> </w:t>
-      </w:r>
-      <w:r>
-        <w:t xml:space="preserve">“</w:t>
-      </w:r>
-      <w:r>
-        <w:t xml:space="preserve">this household,</w:t>
-      </w:r>
-      <w:r>
-        <w:t xml:space="preserve">”</w:t>
-      </w:r>
-      <w:r>
-        <w:t xml:space="preserve"> </w:t>
-      </w:r>
-      <w:r>
-        <w:t xml:space="preserve">then a first-person declaration.</w:t>
+        <w:t xml:space="preserve">[THE COVERING] (about 450 words): Intercession over “this child of God” and “this household,” then a first-person declaration.</w:t>
       </w:r>
     </w:p>
     <w:p>
@@ -8117,25 +5903,7 @@
         <w:pStyle w:val="Compact"/>
       </w:pPr>
       <w:r>
-        <w:t xml:space="preserve">[BRIDGE] (about 120 words):</w:t>
-      </w:r>
-      <w:r>
-        <w:t xml:space="preserve"> </w:t>
-      </w:r>
-      <w:r>
-        <w:t xml:space="preserve">“</w:t>
-      </w:r>
-      <w:r>
-        <w:t xml:space="preserve">Now we walk the battlefield…</w:t>
-      </w:r>
-      <w:r>
-        <w:t xml:space="preserve">”</w:t>
-      </w:r>
-      <w:r>
-        <w:t xml:space="preserve"> </w:t>
-      </w:r>
-      <w:r>
-        <w:t xml:space="preserve">Tell the listener to speak every line from here as their own.</w:t>
+        <w:t xml:space="preserve">[BRIDGE] (about 120 words): “Now we walk the battlefield…” Tell the listener to speak every line from here as their own.</w:t>
       </w:r>
     </w:p>
     <w:p>
@@ -8159,19 +5927,7 @@
         <w:pStyle w:val="Compact"/>
       </w:pPr>
       <w:r>
-        <w:t xml:space="preserve">A thesis strike:</w:t>
-      </w:r>
-      <w:r>
-        <w:t xml:space="preserve"> </w:t>
-      </w:r>
-      <w:r>
-        <w:t xml:space="preserve">“</w:t>
-      </w:r>
-      <w:r>
-        <w:t xml:space="preserve">I [strong verb] every [target]… and I [verb] every [related target].</w:t>
-      </w:r>
-      <w:r>
-        <w:t xml:space="preserve">”</w:t>
+        <w:t xml:space="preserve">A thesis strike: “I [strong verb] every [target]… and I [verb] every [related target].”</w:t>
       </w:r>
     </w:p>
     <w:p>
@@ -8207,19 +5963,7 @@
         <w:pStyle w:val="Compact"/>
       </w:pPr>
       <w:r>
-        <w:t xml:space="preserve">A scripture anchor:</w:t>
-      </w:r>
-      <w:r>
-        <w:t xml:space="preserve"> </w:t>
-      </w:r>
-      <w:r>
-        <w:t xml:space="preserve">“</w:t>
-      </w:r>
-      <w:r>
-        <w:t xml:space="preserve">It is written in [Book chapter and verse]. [exact KJV wording].</w:t>
-      </w:r>
-      <w:r>
-        <w:t xml:space="preserve">”</w:t>
+        <w:t xml:space="preserve">A scripture anchor: “It is written in [Book chapter and verse]. [exact KJV wording].”</w:t>
       </w:r>
     </w:p>
     <w:p>
@@ -8231,34 +5975,7 @@
         <w:pStyle w:val="Compact"/>
       </w:pPr>
       <w:r>
-        <w:t xml:space="preserve">A weaponization line, varied each wave (</w:t>
-      </w:r>
-      <w:r>
-        <w:t xml:space="preserve">“</w:t>
-      </w:r>
-      <w:r>
-        <w:t xml:space="preserve">I take this word as a sword…</w:t>
-      </w:r>
-      <w:r>
-        <w:t xml:space="preserve">”</w:t>
-      </w:r>
-      <w:r>
-        <w:t xml:space="preserve">,</w:t>
-      </w:r>
-      <w:r>
-        <w:t xml:space="preserve"> </w:t>
-      </w:r>
-      <w:r>
-        <w:t xml:space="preserve">“</w:t>
-      </w:r>
-      <w:r>
-        <w:t xml:space="preserve">I lift this word like a banner…</w:t>
-      </w:r>
-      <w:r>
-        <w:t xml:space="preserve">”</w:t>
-      </w:r>
-      <w:r>
-        <w:t xml:space="preserve">).</w:t>
+        <w:t xml:space="preserve">A weaponization line, varied each wave (“I take this word as a sword…”, “I lift this word like a banner…”).</w:t>
       </w:r>
     </w:p>
     <w:p>
@@ -8294,55 +6011,7 @@
         <w:pStyle w:val="Compact"/>
       </w:pPr>
       <w:r>
-        <w:t xml:space="preserve">[MID-PRAYER CALL] (about 80 words), after about 45% of the script:</w:t>
-      </w:r>
-      <w:r>
-        <w:t xml:space="preserve"> </w:t>
-      </w:r>
-      <w:r>
-        <w:t xml:space="preserve">“</w:t>
-      </w:r>
-      <w:r>
-        <w:t xml:space="preserve">Type</w:t>
-      </w:r>
-      <w:r>
-        <w:t xml:space="preserve"> </w:t>
-      </w:r>
-      <w:r>
-        <w:t xml:space="preserve">‘</w:t>
-      </w:r>
-      <w:r>
-        <w:t xml:space="preserve">[declaration]</w:t>
-      </w:r>
-      <w:r>
-        <w:t xml:space="preserve">’</w:t>
-      </w:r>
-      <w:r>
-        <w:t xml:space="preserve"> </w:t>
-      </w:r>
-      <w:r>
-        <w:t xml:space="preserve">in the comments</w:t>
-      </w:r>
-      <w:r>
-        <w:t xml:space="preserve">”</w:t>
-      </w:r>
-      <w:r>
-        <w:t xml:space="preserve"> </w:t>
-      </w:r>
-      <w:r>
-        <w:t xml:space="preserve">plus</w:t>
-      </w:r>
-      <w:r>
-        <w:t xml:space="preserve"> </w:t>
-      </w:r>
-      <w:r>
-        <w:t xml:space="preserve">“</w:t>
-      </w:r>
-      <w:r>
-        <w:t xml:space="preserve">share this with one person who needs it tonight.</w:t>
-      </w:r>
-      <w:r>
-        <w:t xml:space="preserve">”</w:t>
+        <w:t xml:space="preserve">[MID-PRAYER CALL] (about 80 words), after about 45% of the script: “Type ‘[declaration]’ in the comments” plus “share this with one person who needs it tonight.”</w:t>
       </w:r>
     </w:p>
     <w:p>
@@ -8354,19 +6023,7 @@
         <w:pStyle w:val="Compact"/>
       </w:pPr>
       <w:r>
-        <w:t xml:space="preserve">[THE FINAL WORD] (about 550 words): A roll-call of verdict fragments with the verb dropped (</w:t>
-      </w:r>
-      <w:r>
-        <w:t xml:space="preserve">“</w:t>
-      </w:r>
-      <w:r>
-        <w:t xml:space="preserve">Every door, sealed. Every altar, burned. Every arrow, reversed.</w:t>
-      </w:r>
-      <w:r>
-        <w:t xml:space="preserve">”</w:t>
-      </w:r>
-      <w:r>
-        <w:t xml:space="preserve">), then a rapid run of 6–8 scriptures with a one-line application each, then a closing verdict and a second comment call-to-action.</w:t>
+        <w:t xml:space="preserve">[THE FINAL WORD] (about 550 words): A roll-call of verdict fragments with the verb dropped (“Every door, sealed. Every altar, burned. Every arrow, reversed.”), then a rapid run of 6–8 scriptures with a one-line application each, then a closing verdict and a second comment call-to-action.</w:t>
       </w:r>
     </w:p>
     <w:p>
@@ -8378,22 +6035,7 @@
         <w:pStyle w:val="Compact"/>
       </w:pPr>
       <w:r>
-        <w:t xml:space="preserve">[THE QUIET HOUSE] (about 450 words): The cooldown for sleep. The fire becomes warmth; the sentences slow down; guide the breathing;</w:t>
-      </w:r>
-      <w:r>
-        <w:t xml:space="preserve"> </w:t>
-      </w:r>
-      <w:r>
-        <w:t xml:space="preserve">“</w:t>
-      </w:r>
-      <w:r>
-        <w:t xml:space="preserve">you do not have to keep watch, he does</w:t>
-      </w:r>
-      <w:r>
-        <w:t xml:space="preserve">”</w:t>
-      </w:r>
-      <w:r>
-        <w:t xml:space="preserve">; 1–2 rest scriptures (Psalm 4:8, Psalm 127:2, Proverbs 3:24).</w:t>
+        <w:t xml:space="preserve">[THE QUIET HOUSE] (about 450 words): The cooldown for sleep. The fire becomes warmth; the sentences slow down; guide the breathing; “you do not have to keep watch, he does”; 1–2 rest scriptures (Psalm 4:8, Psalm 127:2, Proverbs 3:24).</w:t>
       </w:r>
     </w:p>
     <w:p>
@@ -8405,19 +6047,7 @@
         <w:pStyle w:val="Compact"/>
       </w:pPr>
       <w:r>
-        <w:t xml:space="preserve">[THE SEAL] (about 200 words): A soft first-person declaration, then a sealing prayer, ending</w:t>
-      </w:r>
-      <w:r>
-        <w:t xml:space="preserve"> </w:t>
-      </w:r>
-      <w:r>
-        <w:t xml:space="preserve">“</w:t>
-      </w:r>
-      <w:r>
-        <w:t xml:space="preserve">In the mighty name of Jesus Christ… Amen.</w:t>
-      </w:r>
-      <w:r>
-        <w:t xml:space="preserve">”</w:t>
+        <w:t xml:space="preserve">[THE SEAL] (about 200 words): A soft first-person declaration, then a sealing prayer, ending “In the mighty name of Jesus Christ… Amen.”</w:t>
       </w:r>
     </w:p>
     <w:bookmarkEnd w:id="80"/>
@@ -8439,49 +6069,7 @@
         <w:pStyle w:val="Compact"/>
       </w:pPr>
       <w:r>
-        <w:t xml:space="preserve">Decree and declare; never ask or hope. No</w:t>
-      </w:r>
-      <w:r>
-        <w:t xml:space="preserve"> </w:t>
-      </w:r>
-      <w:r>
-        <w:t xml:space="preserve">“</w:t>
-      </w:r>
-      <w:r>
-        <w:t xml:space="preserve">if it be your will,</w:t>
-      </w:r>
-      <w:r>
-        <w:t xml:space="preserve">”</w:t>
-      </w:r>
-      <w:r>
-        <w:t xml:space="preserve"> </w:t>
-      </w:r>
-      <w:r>
-        <w:t xml:space="preserve">“</w:t>
-      </w:r>
-      <w:r>
-        <w:t xml:space="preserve">maybe</w:t>
-      </w:r>
-      <w:r>
-        <w:t xml:space="preserve">”</w:t>
-      </w:r>
-      <w:r>
-        <w:t xml:space="preserve"> </w:t>
-      </w:r>
-      <w:r>
-        <w:t xml:space="preserve">or</w:t>
-      </w:r>
-      <w:r>
-        <w:t xml:space="preserve"> </w:t>
-      </w:r>
-      <w:r>
-        <w:t xml:space="preserve">“</w:t>
-      </w:r>
-      <w:r>
-        <w:t xml:space="preserve">try to.</w:t>
-      </w:r>
-      <w:r>
-        <w:t xml:space="preserve">”</w:t>
+        <w:t xml:space="preserve">Decree and declare; never ask or hope. No “if it be your will,” “maybe” or “try to.”</w:t>
       </w:r>
     </w:p>
     <w:p>
@@ -8493,25 +6081,7 @@
         <w:pStyle w:val="Compact"/>
       </w:pPr>
       <w:r>
-        <w:t xml:space="preserve">Base sentence:</w:t>
-      </w:r>
-      <w:r>
-        <w:t xml:space="preserve"> </w:t>
-      </w:r>
-      <w:r>
-        <w:t xml:space="preserve">“</w:t>
-      </w:r>
-      <w:r>
-        <w:t xml:space="preserve">I + strong verb + object,</w:t>
-      </w:r>
-      <w:r>
-        <w:t xml:space="preserve">”</w:t>
-      </w:r>
-      <w:r>
-        <w:t xml:space="preserve"> </w:t>
-      </w:r>
-      <w:r>
-        <w:t xml:space="preserve">6–14 words. Verbs: seal, bind, burn, break, cancel, revoke, reverse, sever, expose, scatter, uproot, silence, cover, decree.</w:t>
+        <w:t xml:space="preserve">Base sentence: “I + strong verb + object,” 6–14 words. Verbs: seal, bind, burn, break, cancel, revoke, reverse, sever, expose, scatter, uproot, silence, cover, decree.</w:t>
       </w:r>
     </w:p>
     <w:p>
@@ -8523,19 +6093,7 @@
         <w:pStyle w:val="Compact"/>
       </w:pPr>
       <w:r>
-        <w:t xml:space="preserve">Use anaphora in runs of 3–5 (</w:t>
-      </w:r>
-      <w:r>
-        <w:t xml:space="preserve">“</w:t>
-      </w:r>
-      <w:r>
-        <w:t xml:space="preserve">Every… Every… Every…</w:t>
-      </w:r>
-      <w:r>
-        <w:t xml:space="preserve">”</w:t>
-      </w:r>
-      <w:r>
-        <w:t xml:space="preserve">).</w:t>
+        <w:t xml:space="preserve">Use anaphora in runs of 3–5 (“Every… Every… Every…”).</w:t>
       </w:r>
     </w:p>
     <w:p>
@@ -8559,31 +6117,7 @@
         <w:pStyle w:val="Compact"/>
       </w:pPr>
       <w:r>
-        <w:t xml:space="preserve">Use contrast pairs (</w:t>
-      </w:r>
-      <w:r>
-        <w:t xml:space="preserve">“</w:t>
-      </w:r>
-      <w:r>
-        <w:t xml:space="preserve">not X, but Y</w:t>
-      </w:r>
-      <w:r>
-        <w:t xml:space="preserve">”</w:t>
-      </w:r>
-      <w:r>
-        <w:t xml:space="preserve">) and triple-adjective closers (</w:t>
-      </w:r>
-      <w:r>
-        <w:t xml:space="preserve">“</w:t>
-      </w:r>
-      <w:r>
-        <w:t xml:space="preserve">living, burning, and unbreakable</w:t>
-      </w:r>
-      <w:r>
-        <w:t xml:space="preserve">”</w:t>
-      </w:r>
-      <w:r>
-        <w:t xml:space="preserve">).</w:t>
+        <w:t xml:space="preserve">Use contrast pairs (“not X, but Y”) and triple-adjective closers (“living, burning, and unbreakable”).</w:t>
       </w:r>
     </w:p>
     <w:p>
@@ -8595,97 +6129,7 @@
         <w:pStyle w:val="Compact"/>
       </w:pPr>
       <w:r>
-        <w:t xml:space="preserve">Cycle the address modes:</w:t>
-      </w:r>
-      <w:r>
-        <w:t xml:space="preserve"> </w:t>
-      </w:r>
-      <w:r>
-        <w:t xml:space="preserve">“</w:t>
-      </w:r>
-      <w:r>
-        <w:t xml:space="preserve">you</w:t>
-      </w:r>
-      <w:r>
-        <w:t xml:space="preserve">”</w:t>
-      </w:r>
-      <w:r>
-        <w:t xml:space="preserve"> </w:t>
-      </w:r>
-      <w:r>
-        <w:t xml:space="preserve">to teach,</w:t>
-      </w:r>
-      <w:r>
-        <w:t xml:space="preserve"> </w:t>
-      </w:r>
-      <w:r>
-        <w:t xml:space="preserve">“</w:t>
-      </w:r>
-      <w:r>
-        <w:t xml:space="preserve">we</w:t>
-      </w:r>
-      <w:r>
-        <w:t xml:space="preserve">”</w:t>
-      </w:r>
-      <w:r>
-        <w:t xml:space="preserve"> </w:t>
-      </w:r>
-      <w:r>
-        <w:t xml:space="preserve">and</w:t>
-      </w:r>
-      <w:r>
-        <w:t xml:space="preserve"> </w:t>
-      </w:r>
-      <w:r>
-        <w:t xml:space="preserve">“</w:t>
-      </w:r>
-      <w:r>
-        <w:t xml:space="preserve">this household</w:t>
-      </w:r>
-      <w:r>
-        <w:t xml:space="preserve">”</w:t>
-      </w:r>
-      <w:r>
-        <w:t xml:space="preserve"> </w:t>
-      </w:r>
-      <w:r>
-        <w:t xml:space="preserve">to intercede,</w:t>
-      </w:r>
-      <w:r>
-        <w:t xml:space="preserve"> </w:t>
-      </w:r>
-      <w:r>
-        <w:t xml:space="preserve">“</w:t>
-      </w:r>
-      <w:r>
-        <w:t xml:space="preserve">I</w:t>
-      </w:r>
-      <w:r>
-        <w:t xml:space="preserve">”</w:t>
-      </w:r>
-      <w:r>
-        <w:t xml:space="preserve"> </w:t>
-      </w:r>
-      <w:r>
-        <w:t xml:space="preserve">and</w:t>
-      </w:r>
-      <w:r>
-        <w:t xml:space="preserve"> </w:t>
-      </w:r>
-      <w:r>
-        <w:t xml:space="preserve">“</w:t>
-      </w:r>
-      <w:r>
-        <w:t xml:space="preserve">my</w:t>
-      </w:r>
-      <w:r>
-        <w:t xml:space="preserve">”</w:t>
-      </w:r>
-      <w:r>
-        <w:t xml:space="preserve"> </w:t>
-      </w:r>
-      <w:r>
-        <w:t xml:space="preserve">to declare.</w:t>
+        <w:t xml:space="preserve">Cycle the address modes: “you” to teach, “we” and “this household” to intercede, “I” and “my” to declare.</w:t>
       </w:r>
     </w:p>
     <w:p>
@@ -8755,19 +6199,7 @@
         <w:pStyle w:val="Compact"/>
       </w:pPr>
       <w:r>
-        <w:t xml:space="preserve">Use 12–20 real verses in exact KJV wording, with correct references written as spoken (</w:t>
-      </w:r>
-      <w:r>
-        <w:t xml:space="preserve">“</w:t>
-      </w:r>
-      <w:r>
-        <w:t xml:space="preserve">Psalm 91 and verse 10</w:t>
-      </w:r>
-      <w:r>
-        <w:t xml:space="preserve">”</w:t>
-      </w:r>
-      <w:r>
-        <w:t xml:space="preserve">).</w:t>
+        <w:t xml:space="preserve">Use 12–20 real verses in exact KJV wording, with correct references written as spoken (“Psalm 91 and verse 10”).</w:t>
       </w:r>
     </w:p>
     <w:p>
@@ -8837,25 +6269,7 @@
         <w:pStyle w:val="Compact"/>
       </w:pPr>
       <w:r>
-        <w:t xml:space="preserve">Do not cast any real person, group, religion or ethnicity as</w:t>
-      </w:r>
-      <w:r>
-        <w:t xml:space="preserve"> </w:t>
-      </w:r>
-      <w:r>
-        <w:t xml:space="preserve">“</w:t>
-      </w:r>
-      <w:r>
-        <w:t xml:space="preserve">the enemy.</w:t>
-      </w:r>
-      <w:r>
-        <w:t xml:space="preserve">”</w:t>
-      </w:r>
-      <w:r>
-        <w:t xml:space="preserve"> </w:t>
-      </w:r>
-      <w:r>
-        <w:t xml:space="preserve">The enemy is spiritual only.</w:t>
+        <w:t xml:space="preserve">Do not cast any real person, group, religion or ethnicity as “the enemy.” The enemy is spiritual only.</w:t>
       </w:r>
     </w:p>
     <w:p>
@@ -8942,16 +6356,7 @@
         <w:t xml:space="preserve">Negative prompt</w:t>
       </w:r>
       <w:r>
-        <w:t xml:space="preserve"> </w:t>
-      </w:r>
-      <w:r>
-        <w:t xml:space="preserve">(for tools that support one):</w:t>
-      </w:r>
-      <w:r>
-        <w:t xml:space="preserve"> </w:t>
-      </w:r>
-      <w:r>
-        <w:t xml:space="preserve">text, letters, words, watermark, logo, signature, blue tones, cold colors, cartoon, anime, 3D render look, plastic, low detail, blurry subject, extra limbs, deformed hands, distorted faces, gore, horror, demons with faces, cluttered composition, oversaturated neon</w:t>
+        <w:t xml:space="preserve"> (for tools that support one): text, letters, words, watermark, logo, signature, blue tones, cold colors, cartoon, anime, 3D render look, plastic, low detail, blurry subject, extra limbs, deformed hands, distorted faces, gore, horror, demons with faces, cluttered composition, oversaturated neon</w:t>
       </w:r>
     </w:p>
     <w:p>
@@ -8983,16 +6388,7 @@
         <w:t xml:space="preserve">MODE 1: VIDEO BACKGROUND</w:t>
       </w:r>
       <w:r>
-        <w:t xml:space="preserve"> </w:t>
-      </w:r>
-      <w:r>
-        <w:t xml:space="preserve">(the one image for the whole video)</w:t>
-      </w:r>
-      <w:r>
-        <w:t xml:space="preserve"> </w:t>
-      </w:r>
-      <w:r>
-        <w:t xml:space="preserve">&gt; Centered symmetrical composition with the subject as the single focal point, lower fifth of the frame dark and uncluttered for captions, calm and still enough to hold for an hour.</w:t>
+        <w:t xml:space="preserve"> (the one image for the whole video) &gt; Centered symmetrical composition with the subject as the single focal point, lower fifth of the frame dark and uncluttered for captions, calm and still enough to hold for an hour.</w:t>
       </w:r>
     </w:p>
     <w:p>
@@ -9007,16 +6403,7 @@
         <w:t xml:space="preserve">MODE 2: THUMBNAIL ART</w:t>
       </w:r>
       <w:r>
-        <w:t xml:space="preserve"> </w:t>
-      </w:r>
-      <w:r>
-        <w:t xml:space="preserve">(text is added afterward in Canva)</w:t>
-      </w:r>
-      <w:r>
-        <w:t xml:space="preserve"> </w:t>
-      </w:r>
-      <w:r>
-        <w:t xml:space="preserve">&gt; Subject placed on the right 45% of the frame, angled slightly toward the viewer, bursting with light, sparks and energy; the left 55% of the frame fades to near-black smoky darkness and is completely empty, as negative space for text; bottom-right corner clear; high contrast, dramatic, intense.</w:t>
+        <w:t xml:space="preserve"> (text is added afterward in Canva) &gt; Subject placed on the right 45% of the frame, angled slightly toward the viewer, bursting with light, sparks and energy; the left 55% of the frame fades to near-black smoky darkness and is completely empty, as negative space for text; bottom-right corner clear; high contrast, dramatic, intense.</w:t>
       </w:r>
     </w:p>
     <w:p>
@@ -9031,103 +6418,7 @@
         <w:t xml:space="preserve">MODE 3: THUMBNAIL ALL-IN-ONE</w:t>
       </w:r>
       <w:r>
-        <w:t xml:space="preserve"> </w:t>
-      </w:r>
-      <w:r>
-        <w:t xml:space="preserve">(only for text-capable generators such as Ideogram or GPT image)</w:t>
-      </w:r>
-      <w:r>
-        <w:t xml:space="preserve"> </w:t>
-      </w:r>
-      <w:r>
-        <w:t xml:space="preserve">&gt; Use Mode 2, then replace</w:t>
-      </w:r>
-      <w:r>
-        <w:t xml:space="preserve"> </w:t>
-      </w:r>
-      <w:r>
-        <w:t xml:space="preserve">“</w:t>
-      </w:r>
-      <w:r>
-        <w:t xml:space="preserve">no text, no letters</w:t>
-      </w:r>
-      <w:r>
-        <w:t xml:space="preserve">”</w:t>
-      </w:r>
-      <w:r>
-        <w:t xml:space="preserve"> </w:t>
-      </w:r>
-      <w:r>
-        <w:t xml:space="preserve">with: Left side bold condensed all-caps headline</w:t>
-      </w:r>
-      <w:r>
-        <w:t xml:space="preserve"> </w:t>
-      </w:r>
-      <w:r>
-        <w:t xml:space="preserve">“</w:t>
-      </w:r>
-      <w:r>
-        <w:t xml:space="preserve">[LINE 1]</w:t>
-      </w:r>
-      <w:r>
-        <w:t xml:space="preserve">”</w:t>
-      </w:r>
-      <w:r>
-        <w:t xml:space="preserve"> </w:t>
-      </w:r>
-      <w:r>
-        <w:t xml:space="preserve">in silver-white metallic with dark stroke and</w:t>
-      </w:r>
-      <w:r>
-        <w:t xml:space="preserve"> </w:t>
-      </w:r>
-      <w:r>
-        <w:t xml:space="preserve">“</w:t>
-      </w:r>
-      <w:r>
-        <w:t xml:space="preserve">[LINE 2]</w:t>
-      </w:r>
-      <w:r>
-        <w:t xml:space="preserve">”</w:t>
-      </w:r>
-      <w:r>
-        <w:t xml:space="preserve"> </w:t>
-      </w:r>
-      <w:r>
-        <w:t xml:space="preserve">in fire-gold gradient with glow, small gold flourish divider, gold condensed subline</w:t>
-      </w:r>
-      <w:r>
-        <w:t xml:space="preserve"> </w:t>
-      </w:r>
-      <w:r>
-        <w:t xml:space="preserve">“</w:t>
-      </w:r>
-      <w:r>
-        <w:t xml:space="preserve">[SUBLINE, 6–14 WORDS]</w:t>
-      </w:r>
-      <w:r>
-        <w:t xml:space="preserve">”</w:t>
-      </w:r>
-      <w:r>
-        <w:t xml:space="preserve">, small ribbon</w:t>
-      </w:r>
-      <w:r>
-        <w:t xml:space="preserve"> </w:t>
-      </w:r>
-      <w:r>
-        <w:t xml:space="preserve">“</w:t>
-      </w:r>
-      <w:r>
-        <w:t xml:space="preserve">[CHANNEL NAME]</w:t>
-      </w:r>
-      <w:r>
-        <w:t xml:space="preserve">”</w:t>
-      </w:r>
-      <w:r>
-        <w:t xml:space="preserve"> </w:t>
-      </w:r>
-      <w:r>
-        <w:t xml:space="preserve">between gold scroll ornaments.</w:t>
+        <w:t xml:space="preserve"> (only for text-capable generators such as Ideogram or GPT image) &gt; Use Mode 2, then replace “no text, no letters” with: Left side bold condensed all-caps headline “[LINE 1]” in silver-white metallic with dark stroke and “[LINE 2]” in fire-gold gradient with glow, small gold flourish divider, gold condensed subline “[SUBLINE, 6–14 WORDS]”, small ribbon “SHIELDED TONIGHT PRAYERS” between gold scroll ornaments.</w:t>
       </w:r>
     </w:p>
     <w:p>
@@ -9772,25 +7063,7 @@
         <w:pStyle w:val="Compact"/>
       </w:pPr>
       <w:r>
-        <w:t xml:space="preserve">Keep the</w:t>
-      </w:r>
-      <w:r>
-        <w:t xml:space="preserve"> </w:t>
-      </w:r>
-      <w:r>
-        <w:t xml:space="preserve">“</w:t>
-      </w:r>
-      <w:r>
-        <w:t xml:space="preserve">no text</w:t>
-      </w:r>
-      <w:r>
-        <w:t xml:space="preserve">”</w:t>
-      </w:r>
-      <w:r>
-        <w:t xml:space="preserve"> </w:t>
-      </w:r>
-      <w:r>
-        <w:t xml:space="preserve">instruction in except in Mode 3, and add text in Canva for clean lettering.</w:t>
+        <w:t xml:space="preserve">Keep the “no text” instruction in except in Mode 3, and add text in Canva for clean lettering.</w:t>
       </w:r>
     </w:p>
     <w:p>

</xml_diff>